<commit_message>
final draft: improvements still to do
</commit_message>
<xml_diff>
--- a/AIRS/IFN006 report Oriolson Rodriguez Ramirez.docx
+++ b/AIRS/IFN006 report Oriolson Rodriguez Ramirez.docx
@@ -102,6 +102,7 @@
           <w:docPartUnique/>
         </w:docPartObj>
       </w:sdtPr>
+      <w:sdtEndPr/>
       <w:sdtContent>
         <w:p>
           <w:r>
@@ -2928,15 +2929,7 @@
         <w:t xml:space="preserve">and truncations for the words that are common with variation, for example, </w:t>
       </w:r>
       <w:r>
-        <w:t>“</w:t>
-      </w:r>
-      <w:proofErr w:type="spellStart"/>
-      <w:r>
-        <w:t>reinforc</w:t>
-      </w:r>
-      <w:proofErr w:type="spellEnd"/>
-      <w:r>
-        <w:t>*” which can take the form of “reinforcement”</w:t>
+        <w:t>“reinforc*” which can take the form of “reinforcement”</w:t>
       </w:r>
       <w:r>
         <w:t xml:space="preserve"> or “reinforced”.</w:t>
@@ -2958,63 +2951,7 @@
     </w:p>
     <w:p>
       <w:r>
-        <w:t>TITLE-ABS-KEY ( "multi agent reinforcement learning" OR "multiagent reinforcement learning" OR marl OR "</w:t>
-      </w:r>
-      <w:proofErr w:type="spellStart"/>
-      <w:r>
-        <w:t>decentrali?ed</w:t>
-      </w:r>
-      <w:proofErr w:type="spellEnd"/>
-      <w:r>
-        <w:t xml:space="preserve"> reinforcement learning" OR "stochastic game*" OR "</w:t>
-      </w:r>
-      <w:proofErr w:type="spellStart"/>
-      <w:r>
-        <w:t>markov</w:t>
-      </w:r>
-      <w:proofErr w:type="spellEnd"/>
-      <w:r>
-        <w:t xml:space="preserve"> game*" OR "agent based </w:t>
-      </w:r>
-      <w:proofErr w:type="spellStart"/>
-      <w:r>
-        <w:t>simulat</w:t>
-      </w:r>
-      <w:proofErr w:type="spellEnd"/>
-      <w:r>
-        <w:t xml:space="preserve">*" ) AND ALL ( "preference vector*" OR "preference weight*" OR "weight vector*" OR "preference condition*" OR "multi objective reinforcement learning" OR </w:t>
-      </w:r>
-      <w:proofErr w:type="spellStart"/>
-      <w:r>
-        <w:t>morl</w:t>
-      </w:r>
-      <w:proofErr w:type="spellEnd"/>
-      <w:r>
-        <w:t xml:space="preserve"> OR </w:t>
-      </w:r>
-      <w:proofErr w:type="spellStart"/>
-      <w:r>
-        <w:t>scalari?ation</w:t>
-      </w:r>
-      <w:proofErr w:type="spellEnd"/>
-      <w:r>
-        <w:t xml:space="preserve"> OR "reward weight*" ) AND ALL ( consensus OR "collective decision*" OR "group decision*" OR "emergent agreement" OR "joint policy" OR "joint policies" OR "policy aggregation" OR </w:t>
-      </w:r>
-      <w:proofErr w:type="spellStart"/>
-      <w:r>
-        <w:t>coordinat</w:t>
-      </w:r>
-      <w:proofErr w:type="spellEnd"/>
-      <w:r>
-        <w:t>* OR "social welfare" ) AND ( LIMIT-TO ( SRCTYPE , "j" ) ) AND ( LIMIT-TO ( DOCTYPE , "</w:t>
-      </w:r>
-      <w:proofErr w:type="spellStart"/>
-      <w:r>
-        <w:t>ar</w:t>
-      </w:r>
-      <w:proofErr w:type="spellEnd"/>
-      <w:r>
-        <w:t>" ) OR LIMIT-TO ( DOCTYPE , "re" ) )</w:t>
+        <w:t>TITLE-ABS-KEY ( "multi agent reinforcement learning" OR "multiagent reinforcement learning" OR marl OR "decentrali?ed reinforcement learning" OR "stochastic game*" OR "markov game*" OR "agent based simulat*" ) AND ALL ( "preference vector*" OR "preference weight*" OR "weight vector*" OR "preference condition*" OR "multi objective reinforcement learning" OR morl OR scalari?ation OR "reward weight*" ) AND ALL ( consensus OR "collective decision*" OR "group decision*" OR "emergent agreement" OR "joint policy" OR "joint policies" OR "policy aggregation" OR coordinat* OR "social welfare" ) AND ( LIMIT-TO ( SRCTYPE , "j" ) ) AND ( LIMIT-TO ( DOCTYPE , "ar" ) OR LIMIT-TO ( DOCTYPE , "re" ) )</w:t>
       </w:r>
     </w:p>
     <w:p>
@@ -3296,11 +3233,9 @@
         <w:lastRenderedPageBreak/>
         <w:t xml:space="preserve">this third concept represents. If it happens to be true, it means that we need to revisit the research concept to try to find better terms in the consensus part. The hypothesis is that maybe the third concept, with its keywords, related terms, and synonyms, are not </w:t>
       </w:r>
-      <w:proofErr w:type="spellStart"/>
       <w:r>
         <w:t>fraimed</w:t>
       </w:r>
-      <w:proofErr w:type="spellEnd"/>
       <w:r>
         <w:t xml:space="preserve"> well.</w:t>
       </w:r>
@@ -3329,15 +3264,7 @@
         <w:t xml:space="preserve"> the expansion of the results to </w:t>
       </w:r>
       <w:r>
-        <w:t xml:space="preserve">77. This confirms the hypothesis about </w:t>
-      </w:r>
-      <w:proofErr w:type="spellStart"/>
-      <w:r>
-        <w:t>Consencus</w:t>
-      </w:r>
-      <w:proofErr w:type="spellEnd"/>
-      <w:r>
-        <w:t xml:space="preserve"> term being the restrictive factor.</w:t>
+        <w:t>77. This confirms the hypothesis about Consencus term being the restrictive factor.</w:t>
       </w:r>
       <w:r>
         <w:br/>
@@ -4170,15 +4097,7 @@
         <w:t xml:space="preserve"> filtered by reading the title, abstract and keywords</w:t>
       </w:r>
       <w:r>
-        <w:t xml:space="preserve"> first, this discard some of the irrelevant ones. </w:t>
-      </w:r>
-      <w:proofErr w:type="spellStart"/>
-      <w:r>
-        <w:t>Subsiquently</w:t>
-      </w:r>
-      <w:proofErr w:type="spellEnd"/>
-      <w:r>
-        <w:t xml:space="preserve">, </w:t>
+        <w:t xml:space="preserve"> first, this discard some of the irrelevant ones. Subsiquently, </w:t>
       </w:r>
       <w:r>
         <w:t xml:space="preserve">the selected list of articles are input into </w:t>
@@ -4233,23 +4152,7 @@
         <w:t>For storing and organizing literature Zotero software is being used</w:t>
       </w:r>
       <w:r>
-        <w:t xml:space="preserve"> to Store </w:t>
-      </w:r>
-      <w:proofErr w:type="spellStart"/>
-      <w:r>
-        <w:t>medata</w:t>
-      </w:r>
-      <w:proofErr w:type="spellEnd"/>
-      <w:r>
-        <w:t xml:space="preserve"> (title, abstract, </w:t>
-      </w:r>
-      <w:proofErr w:type="spellStart"/>
-      <w:r>
-        <w:t>authord</w:t>
-      </w:r>
-      <w:proofErr w:type="spellEnd"/>
-      <w:r>
-        <w:t>, DOI etc) and the pdf itself.</w:t>
+        <w:t xml:space="preserve"> to Store medata (title, abstract, authord, DOI etc) and the pdf itself.</w:t>
       </w:r>
       <w:r>
         <w:t xml:space="preserve"> The syncing Zotero feature is disable in order to prevent </w:t>
@@ -4317,13 +4220,8 @@
       <w:r>
         <w:t xml:space="preserve"> using it </w:t>
       </w:r>
-      <w:proofErr w:type="spellStart"/>
-      <w:r>
-        <w:t>pluging</w:t>
-      </w:r>
-      <w:proofErr w:type="spellEnd"/>
-      <w:r>
-        <w:t xml:space="preserve"> to Word text editor. This allows the direct referencing of in-text </w:t>
+      <w:r>
+        <w:t xml:space="preserve">pluging to Word text editor. This allows the direct referencing of in-text </w:t>
       </w:r>
       <w:r>
         <w:t xml:space="preserve"> citations directly from Zotero</w:t>
@@ -4448,32 +4346,28 @@
     </w:p>
     <w:p>
       <w:r>
-        <w:t xml:space="preserve">In Artificial Intelligence related field the </w:t>
-      </w:r>
-      <w:proofErr w:type="spellStart"/>
-      <w:r>
-        <w:t>advace</w:t>
-      </w:r>
-      <w:proofErr w:type="spellEnd"/>
-      <w:r>
-        <w:t xml:space="preserve"> and </w:t>
+        <w:t xml:space="preserve">In Artificial Intelligence related field the advace and </w:t>
       </w:r>
       <w:r>
         <w:t xml:space="preserve">of scientific knowledge is staggering in the las decade. This makes </w:t>
       </w:r>
-      <w:proofErr w:type="spellStart"/>
-      <w:r>
-        <w:t>a</w:t>
-      </w:r>
-      <w:proofErr w:type="spellEnd"/>
-      <w:r>
-        <w:t xml:space="preserve"> awareness strategy necessary to keep the pace of the </w:t>
-      </w:r>
-      <w:r>
-        <w:t xml:space="preserve">of cutting edge </w:t>
-      </w:r>
-      <w:r>
-        <w:t xml:space="preserve">. </w:t>
+      <w:r>
+        <w:t xml:space="preserve">a awareness strategy necessary to keep the pace of the </w:t>
+      </w:r>
+      <w:r>
+        <w:t xml:space="preserve">of cutting </w:t>
+      </w:r>
+      <w:r>
+        <w:t>edge</w:t>
+      </w:r>
+      <w:r>
+        <w:t xml:space="preserve"> AI science</w:t>
+      </w:r>
+      <w:r>
+        <w:t>.</w:t>
+      </w:r>
+      <w:r>
+        <w:t xml:space="preserve"> </w:t>
       </w:r>
     </w:p>
     <w:p>
@@ -4482,11 +4376,68 @@
       </w:pPr>
       <w:bookmarkStart w:id="16" w:name="_Toc474746882"/>
       <w:r>
+        <w:t>Strategy 1:</w:t>
+      </w:r>
+      <w:bookmarkEnd w:id="16"/>
+      <w:r>
+        <w:t xml:space="preserve"> Scopus alarms</w:t>
+      </w:r>
+    </w:p>
+    <w:p>
+      <w:r>
+        <w:t xml:space="preserve">The first awareness strategy is set </w:t>
+      </w:r>
+      <w:r>
+        <w:t xml:space="preserve">using Scopes build-in tool where a periodical alarm sends you an email every stated day </w:t>
+      </w:r>
+      <w:r>
+        <w:t>informing about the newest results on the search statement that the user wants</w:t>
+      </w:r>
+      <w:r>
+        <w:t>. See figure below.</w:t>
+      </w:r>
+    </w:p>
+    <w:p>
+      <w:r>
         <w:lastRenderedPageBreak/>
-        <w:t>Strategy 1:</w:t>
-      </w:r>
-      <w:bookmarkEnd w:id="16"/>
-    </w:p>
+        <w:drawing>
+          <wp:inline distT="0" distB="0" distL="0" distR="0" wp14:anchorId="675B6FAB" wp14:editId="5B84E5F0">
+            <wp:extent cx="3700755" cy="4909399"/>
+            <wp:effectExtent l="0" t="0" r="0" b="5715"/>
+            <wp:docPr id="738605137" name="Picture 1"/>
+            <wp:cNvGraphicFramePr>
+              <a:graphicFrameLocks xmlns:a="http://schemas.openxmlformats.org/drawingml/2006/main" noChangeAspect="1"/>
+            </wp:cNvGraphicFramePr>
+            <a:graphic xmlns:a="http://schemas.openxmlformats.org/drawingml/2006/main">
+              <a:graphicData uri="http://schemas.openxmlformats.org/drawingml/2006/picture">
+                <pic:pic xmlns:pic="http://schemas.openxmlformats.org/drawingml/2006/picture">
+                  <pic:nvPicPr>
+                    <pic:cNvPr id="738605137" name=""/>
+                    <pic:cNvPicPr/>
+                  </pic:nvPicPr>
+                  <pic:blipFill>
+                    <a:blip r:embed="rId13"/>
+                    <a:stretch>
+                      <a:fillRect/>
+                    </a:stretch>
+                  </pic:blipFill>
+                  <pic:spPr>
+                    <a:xfrm>
+                      <a:off x="0" y="0"/>
+                      <a:ext cx="3703775" cy="4913406"/>
+                    </a:xfrm>
+                    <a:prstGeom prst="rect">
+                      <a:avLst/>
+                    </a:prstGeom>
+                  </pic:spPr>
+                </pic:pic>
+              </a:graphicData>
+            </a:graphic>
+          </wp:inline>
+        </w:drawing>
+      </w:r>
+    </w:p>
+    <w:p/>
     <w:p>
       <w:pPr>
         <w:pStyle w:val="Heading3"/>
@@ -4499,6 +4450,72 @@
       <w:r>
         <w:t xml:space="preserve"> </w:t>
       </w:r>
+      <w:r>
+        <w:t xml:space="preserve">Following </w:t>
+      </w:r>
+      <w:r>
+        <w:t xml:space="preserve">lead researchers in </w:t>
+      </w:r>
+      <w:r>
+        <w:t>Linkedin</w:t>
+      </w:r>
+      <w:r>
+        <w:t>.</w:t>
+      </w:r>
+    </w:p>
+    <w:p>
+      <w:r>
+        <w:t xml:space="preserve">The second </w:t>
+      </w:r>
+      <w:r>
+        <w:t>strategy is to follow the top</w:t>
+      </w:r>
+      <w:r>
+        <w:t xml:space="preserve"> researchers in this interdisciplinary field. Usually, lead researchers publish in their linkedin pages when new has been released to the public. One of those researchers is </w:t>
+      </w:r>
+      <w:r>
+        <w:t>Zhen Gao, who is in the author of two of the articles resulting from the search. See figure below.</w:t>
+      </w:r>
+    </w:p>
+    <w:p>
+      <w:r>
+        <w:lastRenderedPageBreak/>
+        <w:drawing>
+          <wp:inline distT="0" distB="0" distL="0" distR="0" wp14:anchorId="38A0D3F6" wp14:editId="6E74F9B1">
+            <wp:extent cx="5731510" cy="4441825"/>
+            <wp:effectExtent l="0" t="0" r="2540" b="0"/>
+            <wp:docPr id="1878055507" name="Picture 1"/>
+            <wp:cNvGraphicFramePr>
+              <a:graphicFrameLocks xmlns:a="http://schemas.openxmlformats.org/drawingml/2006/main" noChangeAspect="1"/>
+            </wp:cNvGraphicFramePr>
+            <a:graphic xmlns:a="http://schemas.openxmlformats.org/drawingml/2006/main">
+              <a:graphicData uri="http://schemas.openxmlformats.org/drawingml/2006/picture">
+                <pic:pic xmlns:pic="http://schemas.openxmlformats.org/drawingml/2006/picture">
+                  <pic:nvPicPr>
+                    <pic:cNvPr id="1878055507" name=""/>
+                    <pic:cNvPicPr/>
+                  </pic:nvPicPr>
+                  <pic:blipFill>
+                    <a:blip r:embed="rId14"/>
+                    <a:stretch>
+                      <a:fillRect/>
+                    </a:stretch>
+                  </pic:blipFill>
+                  <pic:spPr>
+                    <a:xfrm>
+                      <a:off x="0" y="0"/>
+                      <a:ext cx="5731510" cy="4441825"/>
+                    </a:xfrm>
+                    <a:prstGeom prst="rect">
+                      <a:avLst/>
+                    </a:prstGeom>
+                  </pic:spPr>
+                </pic:pic>
+              </a:graphicData>
+            </a:graphic>
+          </wp:inline>
+        </w:drawing>
+      </w:r>
     </w:p>
     <w:p>
       <w:pPr>
@@ -4511,6 +4528,45 @@
       <w:bookmarkEnd w:id="18"/>
       <w:r>
         <w:t xml:space="preserve"> </w:t>
+      </w:r>
+      <w:r>
+        <w:t>Conference attendance and subscription</w:t>
+      </w:r>
+    </w:p>
+    <w:p>
+      <w:r>
+        <w:t xml:space="preserve">The other way to keep </w:t>
+      </w:r>
+      <w:r>
+        <w:t xml:space="preserve">up to date with the latest research developments is to subscribe to email alerts </w:t>
+      </w:r>
+      <w:r>
+        <w:t xml:space="preserve">to the biggest conferences </w:t>
+      </w:r>
+      <w:r>
+        <w:t xml:space="preserve">and to attend to those when possible. In this case, the biggest is </w:t>
+      </w:r>
+      <w:r>
+        <w:rPr>
+          <w:b/>
+          <w:bCs/>
+        </w:rPr>
+        <w:t>AAMAS</w:t>
+      </w:r>
+      <w:r>
+        <w:t xml:space="preserve"> (t</w:t>
+      </w:r>
+      <w:r>
+        <w:t>he International Conference on Autonomous Agents and Multiagent Systems</w:t>
+      </w:r>
+      <w:r>
+        <w:t xml:space="preserve">) </w:t>
+      </w:r>
+      <w:r>
+        <w:t>which take place yearly</w:t>
+      </w:r>
+      <w:r>
+        <w:t xml:space="preserve"> in different cities around the world.</w:t>
       </w:r>
     </w:p>
     <w:p>
@@ -4531,6 +4587,32 @@
       </w:r>
     </w:p>
     <w:p>
+      <w:r>
+        <w:t xml:space="preserve">In this section three provided references are analysed for </w:t>
+      </w:r>
+      <w:r>
+        <w:t xml:space="preserve">authenticity following an structured validation strategy. </w:t>
+      </w:r>
+      <w:r>
+        <w:t xml:space="preserve">For each source a judgement of authenticity is provided and </w:t>
+      </w:r>
+      <w:r>
+        <w:t xml:space="preserve">the </w:t>
+      </w:r>
+      <w:r>
+        <w:t>process that leads to that judgement.</w:t>
+      </w:r>
+      <w:r>
+        <w:t xml:space="preserve"> When the source</w:t>
+      </w:r>
+      <w:r>
+        <w:t xml:space="preserve">’s judgement resolves to “frabricated”, no other criteria is </w:t>
+      </w:r>
+      <w:r>
+        <w:t>used, since, there is not point in continuing.</w:t>
+      </w:r>
+    </w:p>
+    <w:p>
       <w:pPr>
         <w:pStyle w:val="Heading3"/>
       </w:pPr>
@@ -4541,6 +4623,153 @@
       <w:bookmarkEnd w:id="20"/>
     </w:p>
     <w:p>
+      <w:r>
+        <w:t>Gunton, L. &amp; Thorpe, C. (2023). Academic integrity as a shared institutional responsibility: The evolving role of</w:t>
+      </w:r>
+      <w:r>
+        <w:t xml:space="preserve"> </w:t>
+      </w:r>
+      <w:r>
+        <w:t>librarians in higher education. Journal of the Australian Library and Information Association, 72(3), Article 12.</w:t>
+      </w:r>
+      <w:r>
+        <w:t xml:space="preserve"> </w:t>
+      </w:r>
+      <w:hyperlink r:id="rId15" w:history="1">
+        <w:r>
+          <w:rPr>
+            <w:rStyle w:val="Hyperlink"/>
+          </w:rPr>
+          <w:t>https://doi.org/10.1080/24750158.20</w:t>
+        </w:r>
+        <w:r>
+          <w:rPr>
+            <w:rStyle w:val="Hyperlink"/>
+          </w:rPr>
+          <w:t>2</w:t>
+        </w:r>
+        <w:r>
+          <w:rPr>
+            <w:rStyle w:val="Hyperlink"/>
+          </w:rPr>
+          <w:t>5.2460128</w:t>
+        </w:r>
+      </w:hyperlink>
+      <w:r>
+        <w:t xml:space="preserve"> </w:t>
+      </w:r>
+    </w:p>
+    <w:p>
+      <w:pPr>
+        <w:rPr>
+          <w:b/>
+          <w:bCs/>
+        </w:rPr>
+      </w:pPr>
+      <w:r>
+        <w:rPr>
+          <w:b/>
+          <w:bCs/>
+        </w:rPr>
+        <w:t>Authenticity judgement:</w:t>
+      </w:r>
+    </w:p>
+    <w:p>
+      <w:r>
+        <w:t>Fabricated</w:t>
+      </w:r>
+    </w:p>
+    <w:p>
+      <w:pPr>
+        <w:rPr>
+          <w:b/>
+          <w:bCs/>
+        </w:rPr>
+      </w:pPr>
+      <w:r>
+        <w:rPr>
+          <w:b/>
+          <w:bCs/>
+        </w:rPr>
+        <w:lastRenderedPageBreak/>
+        <w:t>Veri</w:t>
+      </w:r>
+      <w:r>
+        <w:rPr>
+          <w:b/>
+          <w:bCs/>
+        </w:rPr>
+        <w:t>fication process and criteria:</w:t>
+      </w:r>
+    </w:p>
+    <w:p>
+      <w:pPr>
+        <w:pStyle w:val="ListParagraph"/>
+        <w:numPr>
+          <w:ilvl w:val="0"/>
+          <w:numId w:val="13"/>
+        </w:numPr>
+        <w:rPr>
+          <w:b/>
+          <w:bCs/>
+        </w:rPr>
+      </w:pPr>
+      <w:r>
+        <w:t xml:space="preserve">Does the metadata </w:t>
+      </w:r>
+      <w:r>
+        <w:t>make sense</w:t>
+      </w:r>
+      <w:r>
+        <w:t>?</w:t>
+      </w:r>
+      <w:r>
+        <w:t xml:space="preserve"> No, The DOI </w:t>
+      </w:r>
+      <w:r>
+        <w:t>shows “</w:t>
+      </w:r>
+      <w:r>
+        <w:t>2025” but the year of publication is 2023. This mismatch gives a bad smell</w:t>
+      </w:r>
+    </w:p>
+    <w:p>
+      <w:pPr>
+        <w:pStyle w:val="ListParagraph"/>
+        <w:numPr>
+          <w:ilvl w:val="0"/>
+          <w:numId w:val="12"/>
+        </w:numPr>
+      </w:pPr>
+      <w:r>
+        <w:t>Does t</w:t>
+      </w:r>
+      <w:r>
+        <w:t xml:space="preserve">he DOI </w:t>
+      </w:r>
+      <w:r>
+        <w:t>resolve</w:t>
+      </w:r>
+      <w:r>
+        <w:t xml:space="preserve"> to the referenced article</w:t>
+      </w:r>
+      <w:r>
+        <w:t>?</w:t>
+      </w:r>
+      <w:r>
+        <w:t xml:space="preserve"> No, </w:t>
+      </w:r>
+      <w:r>
+        <w:t xml:space="preserve">the given DOI leads to </w:t>
+      </w:r>
+      <w:r>
+        <w:t xml:space="preserve">a totally different </w:t>
+      </w:r>
+      <w:r>
+        <w:t>article and different authors.</w:t>
+      </w:r>
+    </w:p>
+    <w:p>
       <w:pPr>
         <w:pStyle w:val="Heading3"/>
       </w:pPr>
@@ -4551,6 +4780,179 @@
       <w:bookmarkEnd w:id="21"/>
     </w:p>
     <w:p>
+      <w:r>
+        <w:t>Walter, M. (2025). Doing Indigenous statistics in Australia: The racial burden of disregard. In Chris Andersen, Maggie</w:t>
+      </w:r>
+      <w:r>
+        <w:t xml:space="preserve"> </w:t>
+      </w:r>
+      <w:r>
+        <w:t>Walter, Tahu Kukutai, &amp; Chelsea Gabel (Eds.), Indigenous statistics: From data deficits to data sovereignty.</w:t>
+      </w:r>
+      <w:r>
+        <w:t xml:space="preserve"> </w:t>
+      </w:r>
+      <w:r>
+        <w:t>(2nd ed., pp. 139–159). Routledge.</w:t>
+      </w:r>
+    </w:p>
+    <w:p>
+      <w:pPr>
+        <w:rPr>
+          <w:b/>
+          <w:bCs/>
+        </w:rPr>
+      </w:pPr>
+      <w:r>
+        <w:rPr>
+          <w:b/>
+          <w:bCs/>
+        </w:rPr>
+        <w:t>Authenticity judgement:</w:t>
+      </w:r>
+    </w:p>
+    <w:p>
+      <w:r>
+        <w:t>Genuine</w:t>
+      </w:r>
+    </w:p>
+    <w:p>
+      <w:pPr>
+        <w:rPr>
+          <w:b/>
+          <w:bCs/>
+        </w:rPr>
+      </w:pPr>
+      <w:r>
+        <w:rPr>
+          <w:b/>
+          <w:bCs/>
+        </w:rPr>
+        <w:t>Verification process and criteria:</w:t>
+      </w:r>
+    </w:p>
+    <w:p>
+      <w:pPr>
+        <w:pStyle w:val="ListParagraph"/>
+        <w:numPr>
+          <w:ilvl w:val="0"/>
+          <w:numId w:val="12"/>
+        </w:numPr>
+      </w:pPr>
+      <w:r>
+        <w:t xml:space="preserve">Is the resource found when </w:t>
+      </w:r>
+      <w:r>
+        <w:t xml:space="preserve">doing </w:t>
+      </w:r>
+      <w:r>
+        <w:t>a</w:t>
+      </w:r>
+      <w:r>
+        <w:t xml:space="preserve"> string</w:t>
+      </w:r>
+      <w:r>
+        <w:t xml:space="preserve"> google search</w:t>
+      </w:r>
+      <w:r>
+        <w:t>?</w:t>
+      </w:r>
+      <w:r>
+        <w:t xml:space="preserve"> </w:t>
+      </w:r>
+      <w:r>
+        <w:t>Y</w:t>
+      </w:r>
+      <w:r>
+        <w:t>es</w:t>
+      </w:r>
+      <w:r>
+        <w:t>.</w:t>
+      </w:r>
+    </w:p>
+    <w:p>
+      <w:pPr>
+        <w:pStyle w:val="ListParagraph"/>
+        <w:numPr>
+          <w:ilvl w:val="0"/>
+          <w:numId w:val="12"/>
+        </w:numPr>
+      </w:pPr>
+      <w:r>
+        <w:t xml:space="preserve">Do the </w:t>
+      </w:r>
+      <w:r>
+        <w:t>authors</w:t>
+      </w:r>
+      <w:r>
+        <w:t xml:space="preserve"> mat</w:t>
+      </w:r>
+      <w:r>
+        <w:t>c</w:t>
+      </w:r>
+      <w:r>
+        <w:t xml:space="preserve">h the </w:t>
+      </w:r>
+      <w:r>
+        <w:t>resource found on the internet? Yes</w:t>
+      </w:r>
+      <w:r>
+        <w:t>.</w:t>
+      </w:r>
+    </w:p>
+    <w:p>
+      <w:pPr>
+        <w:pStyle w:val="ListParagraph"/>
+        <w:numPr>
+          <w:ilvl w:val="0"/>
+          <w:numId w:val="12"/>
+        </w:numPr>
+      </w:pPr>
+      <w:r>
+        <w:t xml:space="preserve">Do the </w:t>
+      </w:r>
+      <w:r>
+        <w:t xml:space="preserve">referenced </w:t>
+      </w:r>
+      <w:r>
+        <w:t xml:space="preserve">pages match the </w:t>
+      </w:r>
+      <w:r>
+        <w:t>books pages? Yes</w:t>
+      </w:r>
+      <w:r>
+        <w:t xml:space="preserve"> (The book is </w:t>
+      </w:r>
+      <w:r>
+        <w:t>open access).</w:t>
+      </w:r>
+    </w:p>
+    <w:p>
+      <w:pPr>
+        <w:pStyle w:val="ListParagraph"/>
+        <w:numPr>
+          <w:ilvl w:val="0"/>
+          <w:numId w:val="12"/>
+        </w:numPr>
+      </w:pPr>
+      <w:r>
+        <w:t>Do</w:t>
+      </w:r>
+      <w:r>
+        <w:t>es</w:t>
+      </w:r>
+      <w:r>
+        <w:t xml:space="preserve"> the referenced chapter match the one in the </w:t>
+      </w:r>
+      <w:r>
+        <w:t>book</w:t>
+      </w:r>
+      <w:r>
+        <w:t>? Yes.</w:t>
+      </w:r>
+    </w:p>
+    <w:p/>
+    <w:p>
       <w:pPr>
         <w:pStyle w:val="Heading3"/>
       </w:pPr>
@@ -4560,6 +4962,177 @@
       </w:r>
       <w:bookmarkEnd w:id="22"/>
     </w:p>
+    <w:p>
+      <w:r>
+        <w:t>Nourizadeh, P., Milford, M., &amp; Fischer, T. (2024, May 13-17). Teach and repeat navigation: A robust control approach</w:t>
+      </w:r>
+      <w:r>
+        <w:t xml:space="preserve"> </w:t>
+      </w:r>
+      <w:r>
+        <w:t>[Conference paper]. 2024 IEEE International Conference on Robotics and Automation (ICRA), Yokohama,</w:t>
+      </w:r>
+      <w:r>
+        <w:t xml:space="preserve"> </w:t>
+      </w:r>
+      <w:r>
+        <w:t xml:space="preserve">Japan, pp. 2909-2916. </w:t>
+      </w:r>
+      <w:hyperlink r:id="rId16" w:history="1">
+        <w:r>
+          <w:rPr>
+            <w:rStyle w:val="Hyperlink"/>
+          </w:rPr>
+          <w:t>https://doi.org/10.1109/ICRA57147.2024.10611662</w:t>
+        </w:r>
+      </w:hyperlink>
+      <w:r>
+        <w:t xml:space="preserve"> </w:t>
+      </w:r>
+    </w:p>
+    <w:p>
+      <w:pPr>
+        <w:rPr>
+          <w:b/>
+          <w:bCs/>
+        </w:rPr>
+      </w:pPr>
+      <w:r>
+        <w:rPr>
+          <w:b/>
+          <w:bCs/>
+        </w:rPr>
+        <w:t>Verification process and criteria:</w:t>
+      </w:r>
+    </w:p>
+    <w:p>
+      <w:pPr>
+        <w:pStyle w:val="ListParagraph"/>
+        <w:numPr>
+          <w:ilvl w:val="0"/>
+          <w:numId w:val="12"/>
+        </w:numPr>
+      </w:pPr>
+      <w:r>
+        <w:t xml:space="preserve">Does the metadata </w:t>
+      </w:r>
+      <w:r>
+        <w:t>make sense</w:t>
+      </w:r>
+      <w:r>
+        <w:t>? Yes</w:t>
+      </w:r>
+      <w:r>
+        <w:t xml:space="preserve">, there is no contradictory information in the reference </w:t>
+      </w:r>
+      <w:r>
+        <w:t>metadata.</w:t>
+      </w:r>
+    </w:p>
+    <w:p>
+      <w:pPr>
+        <w:pStyle w:val="ListParagraph"/>
+        <w:numPr>
+          <w:ilvl w:val="0"/>
+          <w:numId w:val="12"/>
+        </w:numPr>
+      </w:pPr>
+      <w:r>
+        <w:t>Does the DOI revolve to an article with same metadata</w:t>
+      </w:r>
+      <w:r>
+        <w:t xml:space="preserve"> as the reference</w:t>
+      </w:r>
+      <w:r>
+        <w:t>? Yes</w:t>
+      </w:r>
+    </w:p>
+    <w:p>
+      <w:pPr>
+        <w:pStyle w:val="ListParagraph"/>
+        <w:numPr>
+          <w:ilvl w:val="0"/>
+          <w:numId w:val="12"/>
+        </w:numPr>
+      </w:pPr>
+      <w:r>
+        <w:t>Do the authors match the resource found on the internet? Yes</w:t>
+      </w:r>
+      <w:r>
+        <w:t>.</w:t>
+      </w:r>
+    </w:p>
+    <w:p>
+      <w:pPr>
+        <w:pStyle w:val="ListParagraph"/>
+        <w:numPr>
+          <w:ilvl w:val="0"/>
+          <w:numId w:val="12"/>
+        </w:numPr>
+      </w:pPr>
+      <w:r>
+        <w:t xml:space="preserve">Do the </w:t>
+      </w:r>
+      <w:r>
+        <w:t xml:space="preserve">referenced </w:t>
+      </w:r>
+      <w:r>
+        <w:t>pages match the books pages? Yes</w:t>
+      </w:r>
+      <w:r>
+        <w:t>.</w:t>
+      </w:r>
+    </w:p>
+    <w:p>
+      <w:pPr>
+        <w:pStyle w:val="ListParagraph"/>
+        <w:numPr>
+          <w:ilvl w:val="0"/>
+          <w:numId w:val="12"/>
+        </w:numPr>
+      </w:pPr>
+      <w:r>
+        <w:t>Does</w:t>
+      </w:r>
+      <w:r>
+        <w:t xml:space="preserve"> </w:t>
+      </w:r>
+      <w:r>
+        <w:t xml:space="preserve">Journal or conference match the reference? </w:t>
+      </w:r>
+      <w:r>
+        <w:t>Kind of, the reference shows “</w:t>
+      </w:r>
+      <w:r>
+        <w:t>[Conference paper]</w:t>
+      </w:r>
+      <w:r>
+        <w:t>” and the actual conference is “</w:t>
+      </w:r>
+      <w:r>
+        <w:rPr>
+          <w:i/>
+          <w:iCs/>
+        </w:rPr>
+        <w:t>2024 IEEE International Conference on Robotics and Automation (ICRA</w:t>
+      </w:r>
+      <w:r>
+        <w:t>)</w:t>
+      </w:r>
+      <w:r>
+        <w:t xml:space="preserve">” but that does </w:t>
+      </w:r>
+      <w:r>
+        <w:t xml:space="preserve">not make </w:t>
+      </w:r>
+      <w:r>
+        <w:t xml:space="preserve">it fabricated just not </w:t>
+      </w:r>
+      <w:r>
+        <w:t>complete enough.</w:t>
+      </w:r>
+    </w:p>
+    <w:p/>
     <w:p>
       <w:pPr>
         <w:rPr>
@@ -4570,16 +5143,67 @@
         </w:rPr>
       </w:pPr>
       <w:r>
+        <w:lastRenderedPageBreak/>
         <w:br w:type="page"/>
       </w:r>
     </w:p>
     <w:p>
       <w:pPr>
+        <w:rPr>
+          <w:b/>
+          <w:bCs/>
+        </w:rPr>
+      </w:pPr>
+      <w:bookmarkStart w:id="23" w:name="_Toc159275700"/>
+      <w:r>
+        <w:rPr>
+          <w:b/>
+          <w:bCs/>
+        </w:rPr>
+        <w:lastRenderedPageBreak/>
+        <w:t>Authenticity judgement:</w:t>
+      </w:r>
+    </w:p>
+    <w:p>
+      <w:r>
+        <w:t>Genuine</w:t>
+      </w:r>
+    </w:p>
+    <w:p>
+      <w:pPr>
+        <w:rPr>
+          <w:b/>
+          <w:bCs/>
+        </w:rPr>
+      </w:pPr>
+      <w:r>
+        <w:rPr>
+          <w:b/>
+          <w:bCs/>
+        </w:rPr>
+        <w:t>Verification process and criteria:</w:t>
+      </w:r>
+    </w:p>
+    <w:p>
+      <w:pPr>
+        <w:pStyle w:val="ListParagraph"/>
+        <w:numPr>
+          <w:ilvl w:val="0"/>
+          <w:numId w:val="12"/>
+        </w:numPr>
+      </w:pPr>
+      <w:r>
+        <w:t>Is the resource found when doing a string google search? Yes</w:t>
+      </w:r>
+      <w:r>
+        <w:t>.</w:t>
+      </w:r>
+    </w:p>
+    <w:p>
+      <w:pPr>
         <w:pStyle w:val="Heading2"/>
       </w:pPr>
-      <w:bookmarkStart w:id="23" w:name="_Toc159275700"/>
-      <w:r>
-        <w:lastRenderedPageBreak/>
+      <w:r>
         <w:t>Reference list (if needed)</w:t>
       </w:r>
       <w:bookmarkEnd w:id="23"/>
@@ -4644,7 +5268,7 @@
       <w:r>
         <w:t xml:space="preserve">More details can be found here: </w:t>
       </w:r>
-      <w:hyperlink r:id="rId13">
+      <w:hyperlink r:id="rId17">
         <w:r>
           <w:rPr>
             <w:rStyle w:val="Hyperlink"/>
@@ -4841,6 +5465,119 @@
     </w:lvl>
   </w:abstractNum>
   <w:abstractNum w:abstractNumId="2" w15:restartNumberingAfterBreak="0">
+    <w:nsid w:val="07323120"/>
+    <w:multiLevelType w:val="hybridMultilevel"/>
+    <w:tmpl w:val="9A5435A4"/>
+    <w:lvl w:ilvl="0" w:tplc="0C090001">
+      <w:start w:val="1"/>
+      <w:numFmt w:val="bullet"/>
+      <w:lvlText w:val=""/>
+      <w:lvlJc w:val="left"/>
+      <w:pPr>
+        <w:ind w:left="720" w:hanging="360"/>
+      </w:pPr>
+      <w:rPr>
+        <w:rFonts w:ascii="Symbol" w:hAnsi="Symbol" w:hint="default"/>
+      </w:rPr>
+    </w:lvl>
+    <w:lvl w:ilvl="1" w:tplc="0C090003" w:tentative="1">
+      <w:start w:val="1"/>
+      <w:numFmt w:val="bullet"/>
+      <w:lvlText w:val="o"/>
+      <w:lvlJc w:val="left"/>
+      <w:pPr>
+        <w:ind w:left="1440" w:hanging="360"/>
+      </w:pPr>
+      <w:rPr>
+        <w:rFonts w:ascii="Courier New" w:hAnsi="Courier New" w:cs="Courier New" w:hint="default"/>
+      </w:rPr>
+    </w:lvl>
+    <w:lvl w:ilvl="2" w:tplc="0C090005" w:tentative="1">
+      <w:start w:val="1"/>
+      <w:numFmt w:val="bullet"/>
+      <w:lvlText w:val=""/>
+      <w:lvlJc w:val="left"/>
+      <w:pPr>
+        <w:ind w:left="2160" w:hanging="360"/>
+      </w:pPr>
+      <w:rPr>
+        <w:rFonts w:ascii="Wingdings" w:hAnsi="Wingdings" w:hint="default"/>
+      </w:rPr>
+    </w:lvl>
+    <w:lvl w:ilvl="3" w:tplc="0C090001" w:tentative="1">
+      <w:start w:val="1"/>
+      <w:numFmt w:val="bullet"/>
+      <w:lvlText w:val=""/>
+      <w:lvlJc w:val="left"/>
+      <w:pPr>
+        <w:ind w:left="2880" w:hanging="360"/>
+      </w:pPr>
+      <w:rPr>
+        <w:rFonts w:ascii="Symbol" w:hAnsi="Symbol" w:hint="default"/>
+      </w:rPr>
+    </w:lvl>
+    <w:lvl w:ilvl="4" w:tplc="0C090003" w:tentative="1">
+      <w:start w:val="1"/>
+      <w:numFmt w:val="bullet"/>
+      <w:lvlText w:val="o"/>
+      <w:lvlJc w:val="left"/>
+      <w:pPr>
+        <w:ind w:left="3600" w:hanging="360"/>
+      </w:pPr>
+      <w:rPr>
+        <w:rFonts w:ascii="Courier New" w:hAnsi="Courier New" w:cs="Courier New" w:hint="default"/>
+      </w:rPr>
+    </w:lvl>
+    <w:lvl w:ilvl="5" w:tplc="0C090005" w:tentative="1">
+      <w:start w:val="1"/>
+      <w:numFmt w:val="bullet"/>
+      <w:lvlText w:val=""/>
+      <w:lvlJc w:val="left"/>
+      <w:pPr>
+        <w:ind w:left="4320" w:hanging="360"/>
+      </w:pPr>
+      <w:rPr>
+        <w:rFonts w:ascii="Wingdings" w:hAnsi="Wingdings" w:hint="default"/>
+      </w:rPr>
+    </w:lvl>
+    <w:lvl w:ilvl="6" w:tplc="0C090001" w:tentative="1">
+      <w:start w:val="1"/>
+      <w:numFmt w:val="bullet"/>
+      <w:lvlText w:val=""/>
+      <w:lvlJc w:val="left"/>
+      <w:pPr>
+        <w:ind w:left="5040" w:hanging="360"/>
+      </w:pPr>
+      <w:rPr>
+        <w:rFonts w:ascii="Symbol" w:hAnsi="Symbol" w:hint="default"/>
+      </w:rPr>
+    </w:lvl>
+    <w:lvl w:ilvl="7" w:tplc="0C090003" w:tentative="1">
+      <w:start w:val="1"/>
+      <w:numFmt w:val="bullet"/>
+      <w:lvlText w:val="o"/>
+      <w:lvlJc w:val="left"/>
+      <w:pPr>
+        <w:ind w:left="5760" w:hanging="360"/>
+      </w:pPr>
+      <w:rPr>
+        <w:rFonts w:ascii="Courier New" w:hAnsi="Courier New" w:cs="Courier New" w:hint="default"/>
+      </w:rPr>
+    </w:lvl>
+    <w:lvl w:ilvl="8" w:tplc="0C090005" w:tentative="1">
+      <w:start w:val="1"/>
+      <w:numFmt w:val="bullet"/>
+      <w:lvlText w:val=""/>
+      <w:lvlJc w:val="left"/>
+      <w:pPr>
+        <w:ind w:left="6480" w:hanging="360"/>
+      </w:pPr>
+      <w:rPr>
+        <w:rFonts w:ascii="Wingdings" w:hAnsi="Wingdings" w:hint="default"/>
+      </w:rPr>
+    </w:lvl>
+  </w:abstractNum>
+  <w:abstractNum w:abstractNumId="3" w15:restartNumberingAfterBreak="0">
     <w:nsid w:val="0BE10519"/>
     <w:multiLevelType w:val="hybridMultilevel"/>
     <w:tmpl w:val="65D87B7E"/>
@@ -4953,7 +5690,7 @@
       </w:rPr>
     </w:lvl>
   </w:abstractNum>
-  <w:abstractNum w:abstractNumId="3" w15:restartNumberingAfterBreak="0">
+  <w:abstractNum w:abstractNumId="4" w15:restartNumberingAfterBreak="0">
     <w:nsid w:val="10357994"/>
     <w:multiLevelType w:val="hybridMultilevel"/>
     <w:tmpl w:val="CFD49670"/>
@@ -5066,7 +5803,7 @@
       </w:rPr>
     </w:lvl>
   </w:abstractNum>
-  <w:abstractNum w:abstractNumId="4" w15:restartNumberingAfterBreak="0">
+  <w:abstractNum w:abstractNumId="5" w15:restartNumberingAfterBreak="0">
     <w:nsid w:val="1C833B1E"/>
     <w:multiLevelType w:val="hybridMultilevel"/>
     <w:tmpl w:val="3E34D8CA"/>
@@ -5179,7 +5916,7 @@
       </w:rPr>
     </w:lvl>
   </w:abstractNum>
-  <w:abstractNum w:abstractNumId="5" w15:restartNumberingAfterBreak="0">
+  <w:abstractNum w:abstractNumId="6" w15:restartNumberingAfterBreak="0">
     <w:nsid w:val="22373DC2"/>
     <w:multiLevelType w:val="hybridMultilevel"/>
     <w:tmpl w:val="F5ECE2BC"/>
@@ -5292,7 +6029,7 @@
       </w:rPr>
     </w:lvl>
   </w:abstractNum>
-  <w:abstractNum w:abstractNumId="6" w15:restartNumberingAfterBreak="0">
+  <w:abstractNum w:abstractNumId="7" w15:restartNumberingAfterBreak="0">
     <w:nsid w:val="2B325676"/>
     <w:multiLevelType w:val="hybridMultilevel"/>
     <w:tmpl w:val="69705AAC"/>
@@ -5378,7 +6115,120 @@
       </w:pPr>
     </w:lvl>
   </w:abstractNum>
-  <w:abstractNum w:abstractNumId="7" w15:restartNumberingAfterBreak="0">
+  <w:abstractNum w:abstractNumId="8" w15:restartNumberingAfterBreak="0">
+    <w:nsid w:val="5C5F00AA"/>
+    <w:multiLevelType w:val="hybridMultilevel"/>
+    <w:tmpl w:val="66A676DC"/>
+    <w:lvl w:ilvl="0" w:tplc="0C090001">
+      <w:start w:val="1"/>
+      <w:numFmt w:val="bullet"/>
+      <w:lvlText w:val=""/>
+      <w:lvlJc w:val="left"/>
+      <w:pPr>
+        <w:ind w:left="720" w:hanging="360"/>
+      </w:pPr>
+      <w:rPr>
+        <w:rFonts w:ascii="Symbol" w:hAnsi="Symbol" w:hint="default"/>
+      </w:rPr>
+    </w:lvl>
+    <w:lvl w:ilvl="1" w:tplc="0C090003" w:tentative="1">
+      <w:start w:val="1"/>
+      <w:numFmt w:val="bullet"/>
+      <w:lvlText w:val="o"/>
+      <w:lvlJc w:val="left"/>
+      <w:pPr>
+        <w:ind w:left="1440" w:hanging="360"/>
+      </w:pPr>
+      <w:rPr>
+        <w:rFonts w:ascii="Courier New" w:hAnsi="Courier New" w:cs="Courier New" w:hint="default"/>
+      </w:rPr>
+    </w:lvl>
+    <w:lvl w:ilvl="2" w:tplc="0C090005" w:tentative="1">
+      <w:start w:val="1"/>
+      <w:numFmt w:val="bullet"/>
+      <w:lvlText w:val=""/>
+      <w:lvlJc w:val="left"/>
+      <w:pPr>
+        <w:ind w:left="2160" w:hanging="360"/>
+      </w:pPr>
+      <w:rPr>
+        <w:rFonts w:ascii="Wingdings" w:hAnsi="Wingdings" w:hint="default"/>
+      </w:rPr>
+    </w:lvl>
+    <w:lvl w:ilvl="3" w:tplc="0C090001" w:tentative="1">
+      <w:start w:val="1"/>
+      <w:numFmt w:val="bullet"/>
+      <w:lvlText w:val=""/>
+      <w:lvlJc w:val="left"/>
+      <w:pPr>
+        <w:ind w:left="2880" w:hanging="360"/>
+      </w:pPr>
+      <w:rPr>
+        <w:rFonts w:ascii="Symbol" w:hAnsi="Symbol" w:hint="default"/>
+      </w:rPr>
+    </w:lvl>
+    <w:lvl w:ilvl="4" w:tplc="0C090003" w:tentative="1">
+      <w:start w:val="1"/>
+      <w:numFmt w:val="bullet"/>
+      <w:lvlText w:val="o"/>
+      <w:lvlJc w:val="left"/>
+      <w:pPr>
+        <w:ind w:left="3600" w:hanging="360"/>
+      </w:pPr>
+      <w:rPr>
+        <w:rFonts w:ascii="Courier New" w:hAnsi="Courier New" w:cs="Courier New" w:hint="default"/>
+      </w:rPr>
+    </w:lvl>
+    <w:lvl w:ilvl="5" w:tplc="0C090005" w:tentative="1">
+      <w:start w:val="1"/>
+      <w:numFmt w:val="bullet"/>
+      <w:lvlText w:val=""/>
+      <w:lvlJc w:val="left"/>
+      <w:pPr>
+        <w:ind w:left="4320" w:hanging="360"/>
+      </w:pPr>
+      <w:rPr>
+        <w:rFonts w:ascii="Wingdings" w:hAnsi="Wingdings" w:hint="default"/>
+      </w:rPr>
+    </w:lvl>
+    <w:lvl w:ilvl="6" w:tplc="0C090001" w:tentative="1">
+      <w:start w:val="1"/>
+      <w:numFmt w:val="bullet"/>
+      <w:lvlText w:val=""/>
+      <w:lvlJc w:val="left"/>
+      <w:pPr>
+        <w:ind w:left="5040" w:hanging="360"/>
+      </w:pPr>
+      <w:rPr>
+        <w:rFonts w:ascii="Symbol" w:hAnsi="Symbol" w:hint="default"/>
+      </w:rPr>
+    </w:lvl>
+    <w:lvl w:ilvl="7" w:tplc="0C090003" w:tentative="1">
+      <w:start w:val="1"/>
+      <w:numFmt w:val="bullet"/>
+      <w:lvlText w:val="o"/>
+      <w:lvlJc w:val="left"/>
+      <w:pPr>
+        <w:ind w:left="5760" w:hanging="360"/>
+      </w:pPr>
+      <w:rPr>
+        <w:rFonts w:ascii="Courier New" w:hAnsi="Courier New" w:cs="Courier New" w:hint="default"/>
+      </w:rPr>
+    </w:lvl>
+    <w:lvl w:ilvl="8" w:tplc="0C090005" w:tentative="1">
+      <w:start w:val="1"/>
+      <w:numFmt w:val="bullet"/>
+      <w:lvlText w:val=""/>
+      <w:lvlJc w:val="left"/>
+      <w:pPr>
+        <w:ind w:left="6480" w:hanging="360"/>
+      </w:pPr>
+      <w:rPr>
+        <w:rFonts w:ascii="Wingdings" w:hAnsi="Wingdings" w:hint="default"/>
+      </w:rPr>
+    </w:lvl>
+  </w:abstractNum>
+  <w:abstractNum w:abstractNumId="9" w15:restartNumberingAfterBreak="0">
     <w:nsid w:val="611957B3"/>
     <w:multiLevelType w:val="multilevel"/>
     <w:tmpl w:val="47A858EA"/>
@@ -5527,7 +6377,7 @@
       </w:rPr>
     </w:lvl>
   </w:abstractNum>
-  <w:abstractNum w:abstractNumId="8" w15:restartNumberingAfterBreak="0">
+  <w:abstractNum w:abstractNumId="10" w15:restartNumberingAfterBreak="0">
     <w:nsid w:val="6E963C9C"/>
     <w:multiLevelType w:val="multilevel"/>
     <w:tmpl w:val="0C09001F"/>
@@ -5613,7 +6463,7 @@
       </w:pPr>
     </w:lvl>
   </w:abstractNum>
-  <w:abstractNum w:abstractNumId="9" w15:restartNumberingAfterBreak="0">
+  <w:abstractNum w:abstractNumId="11" w15:restartNumberingAfterBreak="0">
     <w:nsid w:val="76502E9C"/>
     <w:multiLevelType w:val="multilevel"/>
     <w:tmpl w:val="091E405C"/>
@@ -5701,37 +6551,37 @@
     </w:lvl>
   </w:abstractNum>
   <w:num w:numId="1" w16cid:durableId="1383210634">
-    <w:abstractNumId w:val="2"/>
+    <w:abstractNumId w:val="3"/>
   </w:num>
   <w:num w:numId="2" w16cid:durableId="1315138699">
-    <w:abstractNumId w:val="4"/>
+    <w:abstractNumId w:val="5"/>
   </w:num>
   <w:num w:numId="3" w16cid:durableId="683287785">
-    <w:abstractNumId w:val="6"/>
+    <w:abstractNumId w:val="7"/>
   </w:num>
   <w:num w:numId="4" w16cid:durableId="1592852956">
     <w:abstractNumId w:val="1"/>
   </w:num>
   <w:num w:numId="5" w16cid:durableId="1844320523">
-    <w:abstractNumId w:val="9"/>
+    <w:abstractNumId w:val="11"/>
   </w:num>
   <w:num w:numId="6" w16cid:durableId="2013604388">
-    <w:abstractNumId w:val="8"/>
+    <w:abstractNumId w:val="10"/>
   </w:num>
   <w:num w:numId="7" w16cid:durableId="515778692">
     <w:abstractNumId w:val="0"/>
   </w:num>
   <w:num w:numId="8" w16cid:durableId="1356031321">
-    <w:abstractNumId w:val="7"/>
+    <w:abstractNumId w:val="9"/>
   </w:num>
   <w:num w:numId="9" w16cid:durableId="652683066">
-    <w:abstractNumId w:val="5"/>
+    <w:abstractNumId w:val="6"/>
   </w:num>
   <w:num w:numId="10" w16cid:durableId="783234174">
-    <w:abstractNumId w:val="3"/>
+    <w:abstractNumId w:val="4"/>
   </w:num>
   <w:num w:numId="11" w16cid:durableId="1060249197">
-    <w:abstractNumId w:val="9"/>
+    <w:abstractNumId w:val="11"/>
     <w:lvlOverride w:ilvl="0">
       <w:startOverride w:val="1"/>
     </w:lvlOverride>
@@ -5759,6 +6609,12 @@
     <w:lvlOverride w:ilvl="8">
       <w:startOverride w:val="1"/>
     </w:lvlOverride>
+  </w:num>
+  <w:num w:numId="12" w16cid:durableId="363940914">
+    <w:abstractNumId w:val="8"/>
+  </w:num>
+  <w:num w:numId="13" w16cid:durableId="646935549">
+    <w:abstractNumId w:val="2"/>
   </w:num>
 </w:numbering>
 </file>
@@ -6163,7 +7019,7 @@
   <w:style w:type="paragraph" w:default="1" w:styleId="Normal">
     <w:name w:val="Normal"/>
     <w:qFormat/>
-    <w:rsid w:val="00D05188"/>
+    <w:rsid w:val="00282AAA"/>
   </w:style>
   <w:style w:type="paragraph" w:styleId="Heading1">
     <w:name w:val="heading 1"/>
@@ -6751,6 +7607,30 @@
       <w:kern w:val="0"/>
       <w:lang w:eastAsia="en-AU"/>
       <w14:ligatures w14:val="none"/>
+    </w:rPr>
+  </w:style>
+  <w:style w:type="character" w:styleId="UnresolvedMention">
+    <w:name w:val="Unresolved Mention"/>
+    <w:basedOn w:val="DefaultParagraphFont"/>
+    <w:uiPriority w:val="99"/>
+    <w:semiHidden/>
+    <w:unhideWhenUsed/>
+    <w:rsid w:val="00E32269"/>
+    <w:rPr>
+      <w:color w:val="605E5C"/>
+      <w:shd w:val="clear" w:color="auto" w:fill="E1DFDD"/>
+    </w:rPr>
+  </w:style>
+  <w:style w:type="character" w:styleId="FollowedHyperlink">
+    <w:name w:val="FollowedHyperlink"/>
+    <w:basedOn w:val="DefaultParagraphFont"/>
+    <w:uiPriority w:val="99"/>
+    <w:semiHidden/>
+    <w:unhideWhenUsed/>
+    <w:rsid w:val="00E32269"/>
+    <w:rPr>
+      <w:color w:val="96607D" w:themeColor="followedHyperlink"/>
+      <w:u w:val="single"/>
     </w:rPr>
   </w:style>
 </w:styles>

</xml_diff>

<commit_message>
Final version of the first 3 sections
</commit_message>
<xml_diff>
--- a/AIRS/IFN006 report Oriolson Rodriguez Ramirez.docx
+++ b/AIRS/IFN006 report Oriolson Rodriguez Ramirez.docx
@@ -1367,642 +1367,512 @@
       <w:bookmarkEnd w:id="0"/>
     </w:p>
     <w:p>
-      <w:r>
+      <w:pPr>
+        <w:pStyle w:val="Heading2"/>
+        <w:ind w:left="360"/>
+        <w:jc w:val="both"/>
         <w:rPr>
-          <w:lang w:val="en-US"/>
+          <w:rFonts w:asciiTheme="minorHAnsi" w:eastAsiaTheme="minorHAnsi" w:hAnsiTheme="minorHAnsi" w:cstheme="minorBidi"/>
+          <w:color w:val="auto"/>
+          <w:sz w:val="24"/>
+          <w:szCs w:val="24"/>
+        </w:rPr>
+      </w:pPr>
+      <w:bookmarkStart w:id="1" w:name="_Toc1569493088"/>
+      <w:r>
+        <w:rPr>
+          <w:rFonts w:asciiTheme="minorHAnsi" w:eastAsiaTheme="minorHAnsi" w:hAnsiTheme="minorHAnsi" w:cstheme="minorBidi"/>
+          <w:color w:val="auto"/>
+          <w:sz w:val="24"/>
+          <w:szCs w:val="24"/>
         </w:rPr>
         <w:t xml:space="preserve">This document </w:t>
       </w:r>
       <w:r>
         <w:rPr>
-          <w:lang w:val="en-US"/>
+          <w:rFonts w:asciiTheme="minorHAnsi" w:eastAsiaTheme="minorHAnsi" w:hAnsiTheme="minorHAnsi" w:cstheme="minorBidi"/>
+          <w:color w:val="auto"/>
+          <w:sz w:val="24"/>
+          <w:szCs w:val="24"/>
         </w:rPr>
-        <w:t>shows</w:t>
+        <w:t>presents</w:t>
       </w:r>
       <w:r>
         <w:rPr>
-          <w:lang w:val="en-US"/>
+          <w:rFonts w:asciiTheme="minorHAnsi" w:eastAsiaTheme="minorHAnsi" w:hAnsiTheme="minorHAnsi" w:cstheme="minorBidi"/>
+          <w:color w:val="auto"/>
+          <w:sz w:val="24"/>
+          <w:szCs w:val="24"/>
         </w:rPr>
-        <w:t xml:space="preserve"> a detailed </w:t>
+        <w:t xml:space="preserve"> a detailed Research Information Strategy Report</w:t>
       </w:r>
       <w:r>
         <w:rPr>
-          <w:lang w:val="en-US"/>
+          <w:rFonts w:asciiTheme="minorHAnsi" w:eastAsiaTheme="minorHAnsi" w:hAnsiTheme="minorHAnsi" w:cstheme="minorBidi"/>
+          <w:color w:val="auto"/>
+          <w:sz w:val="24"/>
+          <w:szCs w:val="24"/>
         </w:rPr>
-        <w:t>R</w:t>
+        <w:t xml:space="preserve"> subdivided into sections. It starts with the research question</w:t>
       </w:r>
       <w:r>
         <w:rPr>
-          <w:lang w:val="en-US"/>
+          <w:rFonts w:asciiTheme="minorHAnsi" w:eastAsiaTheme="minorHAnsi" w:hAnsiTheme="minorHAnsi" w:cstheme="minorBidi"/>
+          <w:color w:val="auto"/>
+          <w:sz w:val="24"/>
+          <w:szCs w:val="24"/>
         </w:rPr>
-        <w:t xml:space="preserve">esearch </w:t>
+        <w:t>. Then, t</w:t>
       </w:r>
       <w:r>
         <w:rPr>
-          <w:lang w:val="en-US"/>
+          <w:rFonts w:asciiTheme="minorHAnsi" w:eastAsiaTheme="minorHAnsi" w:hAnsiTheme="minorHAnsi" w:cstheme="minorBidi"/>
+          <w:color w:val="auto"/>
+          <w:sz w:val="24"/>
+          <w:szCs w:val="24"/>
+        </w:rPr>
+        <w:t xml:space="preserve">his question is decomposed into concepts and keywords that will help construct the search string. </w:t>
+      </w:r>
+      <w:r>
+        <w:rPr>
+          <w:rFonts w:asciiTheme="minorHAnsi" w:eastAsiaTheme="minorHAnsi" w:hAnsiTheme="minorHAnsi" w:cstheme="minorBidi"/>
+          <w:color w:val="auto"/>
+          <w:sz w:val="24"/>
+          <w:szCs w:val="24"/>
         </w:rPr>
         <w:t>I</w:t>
       </w:r>
       <w:r>
         <w:rPr>
-          <w:lang w:val="en-US"/>
+          <w:rFonts w:asciiTheme="minorHAnsi" w:eastAsiaTheme="minorHAnsi" w:hAnsiTheme="minorHAnsi" w:cstheme="minorBidi"/>
+          <w:color w:val="auto"/>
+          <w:sz w:val="24"/>
+          <w:szCs w:val="24"/>
         </w:rPr>
-        <w:t xml:space="preserve">nformation </w:t>
+        <w:t>t shows the database selection followed by the research strategy that contains the search statement and its findings. Afterwards, it present</w:t>
       </w:r>
       <w:r>
         <w:rPr>
-          <w:lang w:val="en-US"/>
+          <w:rFonts w:asciiTheme="minorHAnsi" w:eastAsiaTheme="minorHAnsi" w:hAnsiTheme="minorHAnsi" w:cstheme="minorBidi"/>
+          <w:color w:val="auto"/>
+          <w:sz w:val="24"/>
+          <w:szCs w:val="24"/>
         </w:rPr>
-        <w:t>S</w:t>
+        <w:t>s</w:t>
       </w:r>
       <w:r>
         <w:rPr>
-          <w:lang w:val="en-US"/>
+          <w:rFonts w:asciiTheme="minorHAnsi" w:eastAsiaTheme="minorHAnsi" w:hAnsiTheme="minorHAnsi" w:cstheme="minorBidi"/>
+          <w:color w:val="auto"/>
+          <w:sz w:val="24"/>
+          <w:szCs w:val="24"/>
         </w:rPr>
-        <w:t>trategy</w:t>
+        <w:t xml:space="preserve"> the information management strategy followed by the current awareness strategy, where the document will show how to keep the researcher updated with the latest developments in the field. Finally, it will move to the analysis of some sources; in this section, three provided sources </w:t>
       </w:r>
       <w:r>
         <w:rPr>
-          <w:lang w:val="en-US"/>
+          <w:rFonts w:asciiTheme="minorHAnsi" w:eastAsiaTheme="minorHAnsi" w:hAnsiTheme="minorHAnsi" w:cstheme="minorBidi"/>
+          <w:color w:val="auto"/>
+          <w:sz w:val="24"/>
+          <w:szCs w:val="24"/>
         </w:rPr>
-        <w:t xml:space="preserve"> Report subdivided in sections</w:t>
+        <w:t>are</w:t>
       </w:r>
       <w:r>
         <w:rPr>
-          <w:lang w:val="en-US"/>
+          <w:rFonts w:asciiTheme="minorHAnsi" w:eastAsiaTheme="minorHAnsi" w:hAnsiTheme="minorHAnsi" w:cstheme="minorBidi"/>
+          <w:color w:val="auto"/>
+          <w:sz w:val="24"/>
+          <w:szCs w:val="24"/>
         </w:rPr>
-        <w:t xml:space="preserve">. It starts with </w:t>
-      </w:r>
-      <w:r>
-        <w:t>the research question</w:t>
-      </w:r>
+        <w:t xml:space="preserve"> analysed for authenticity</w:t>
+      </w:r>
+      <w:r>
+        <w:rPr>
+          <w:rFonts w:asciiTheme="minorHAnsi" w:eastAsiaTheme="minorHAnsi" w:hAnsiTheme="minorHAnsi" w:cstheme="minorBidi"/>
+          <w:color w:val="auto"/>
+          <w:sz w:val="24"/>
+          <w:szCs w:val="24"/>
+        </w:rPr>
+        <w:t>.</w:t>
+      </w:r>
+    </w:p>
+    <w:p>
+      <w:pPr>
+        <w:pStyle w:val="Heading3"/>
+      </w:pPr>
+      <w:r>
+        <w:t>Research question</w:t>
+      </w:r>
+      <w:bookmarkEnd w:id="1"/>
       <w:r>
         <w:t xml:space="preserve"> </w:t>
       </w:r>
-      <w:r>
-        <w:t>that</w:t>
-      </w:r>
+      <w:bookmarkStart w:id="2" w:name="_Toc1120900347"/>
+    </w:p>
+    <w:p>
+      <w:pPr>
+        <w:pStyle w:val="Heading3"/>
+        <w:numPr>
+          <w:ilvl w:val="1"/>
+          <w:numId w:val="5"/>
+        </w:numPr>
+      </w:pPr>
+      <w:r>
+        <w:t xml:space="preserve">Research </w:t>
+      </w:r>
+      <w:r>
+        <w:t>q</w:t>
+      </w:r>
+      <w:r>
+        <w:t>uestion</w:t>
+      </w:r>
+      <w:bookmarkEnd w:id="2"/>
       <w:r>
         <w:t xml:space="preserve"> </w:t>
       </w:r>
       <w:r>
+        <w:t xml:space="preserve"> </w:t>
+      </w:r>
+    </w:p>
+    <w:p>
+      <w:r>
+        <w:t xml:space="preserve"> </w:t>
+      </w:r>
+      <w:bookmarkStart w:id="3" w:name="_Toc953919908"/>
+      <w:r>
+        <w:t xml:space="preserve">The following research question </w:t>
+      </w:r>
+      <w:r>
+        <w:t xml:space="preserve">is </w:t>
+      </w:r>
+      <w:r>
+        <w:t>part</w:t>
+      </w:r>
+      <w:r>
+        <w:t xml:space="preserve"> of a set of three that</w:t>
+      </w:r>
+      <w:r>
+        <w:t xml:space="preserve"> is </w:t>
+      </w:r>
+      <w:r>
+        <w:t xml:space="preserve">the </w:t>
+      </w:r>
+      <w:r>
+        <w:t>actual</w:t>
+      </w:r>
+      <w:r>
+        <w:t xml:space="preserve"> authors research</w:t>
+      </w:r>
+      <w:r>
+        <w:t xml:space="preserve"> project. </w:t>
+      </w:r>
+      <w:proofErr w:type="gramStart"/>
+      <w:r>
+        <w:t>For the purpose of</w:t>
+      </w:r>
+      <w:proofErr w:type="gramEnd"/>
+      <w:r>
+        <w:t xml:space="preserve"> this document, only the third one </w:t>
+      </w:r>
+      <w:r>
         <w:t>is</w:t>
       </w:r>
       <w:r>
-        <w:t xml:space="preserve"> part of my research project</w:t>
-      </w:r>
-      <w:r>
-        <w:t>;</w:t>
-      </w:r>
-      <w:r>
+        <w:t xml:space="preserve"> analysed.</w:t>
+      </w:r>
+    </w:p>
+    <w:p>
+      <w:pPr>
+        <w:rPr>
+          <w:i/>
+          <w:iCs/>
+        </w:rPr>
+      </w:pPr>
+      <w:r>
+        <w:rPr>
+          <w:i/>
+          <w:iCs/>
+        </w:rPr>
+        <w:t>Research question: How to build a MARL simulation, parametrized by preference vectors, to predict consensus output?</w:t>
+      </w:r>
+    </w:p>
+    <w:p>
+      <w:r>
+        <w:t>This project uses natural language processing to analyse diplomatic text that has been submitted to the Antarctic Treaty Consultative Meetings (ATCM) that take place every year. The first and second parts of this project contain two questions that are focused on extracting, out of the diplomatic text, the positions or vectors of different countries throughout the history of the ATCMs</w:t>
+      </w:r>
+      <w:r>
+        <w:t xml:space="preserve">. </w:t>
+      </w:r>
+      <w:r>
+        <w:t>T</w:t>
+      </w:r>
+      <w:r>
+        <w:t>hese are the parametric vectors</w:t>
+      </w:r>
+      <w:r>
+        <w:t xml:space="preserve"> that</w:t>
+      </w:r>
+      <w:r>
+        <w:t>, in the question above, are used to build a multi</w:t>
+      </w:r>
+      <w:r>
+        <w:t xml:space="preserve">-agent reinforcement learning (MARL) simulation, to match the historical outputs of the ATCM, and then predict the outputs of future </w:t>
+      </w:r>
+      <w:r>
+        <w:t xml:space="preserve">ATCMs, which </w:t>
+      </w:r>
+      <w:r>
+        <w:t>decide</w:t>
+      </w:r>
+      <w:r>
+        <w:t xml:space="preserve"> everything through consensus.</w:t>
+      </w:r>
+    </w:p>
+    <w:p>
+      <w:pPr>
+        <w:pStyle w:val="ListParagraph"/>
+        <w:numPr>
+          <w:ilvl w:val="1"/>
+          <w:numId w:val="5"/>
+        </w:numPr>
+        <w:rPr>
+          <w:rFonts w:eastAsiaTheme="majorEastAsia" w:cstheme="majorBidi"/>
+          <w:color w:val="0F4761" w:themeColor="accent1" w:themeShade="BF"/>
+          <w:sz w:val="26"/>
+          <w:szCs w:val="28"/>
+        </w:rPr>
+      </w:pPr>
+      <w:r>
+        <w:rPr>
+          <w:rFonts w:eastAsiaTheme="majorEastAsia" w:cstheme="majorBidi"/>
+          <w:color w:val="0F4761" w:themeColor="accent1" w:themeShade="BF"/>
+          <w:sz w:val="26"/>
+          <w:szCs w:val="28"/>
+        </w:rPr>
+        <w:t xml:space="preserve">Research </w:t>
+      </w:r>
+      <w:r>
+        <w:rPr>
+          <w:rFonts w:eastAsiaTheme="majorEastAsia" w:cstheme="majorBidi"/>
+          <w:color w:val="0F4761" w:themeColor="accent1" w:themeShade="BF"/>
+          <w:sz w:val="26"/>
+          <w:szCs w:val="28"/>
+        </w:rPr>
+        <w:t>c</w:t>
+      </w:r>
+      <w:r>
+        <w:rPr>
+          <w:rFonts w:eastAsiaTheme="majorEastAsia" w:cstheme="majorBidi"/>
+          <w:color w:val="0F4761" w:themeColor="accent1" w:themeShade="BF"/>
+          <w:sz w:val="26"/>
+          <w:szCs w:val="28"/>
+        </w:rPr>
+        <w:t>oncepts</w:t>
+      </w:r>
+      <w:bookmarkEnd w:id="3"/>
+      <w:r>
+        <w:rPr>
+          <w:rFonts w:eastAsiaTheme="majorEastAsia" w:cstheme="majorBidi"/>
+          <w:color w:val="0F4761" w:themeColor="accent1" w:themeShade="BF"/>
+          <w:sz w:val="26"/>
+          <w:szCs w:val="28"/>
+        </w:rPr>
         <w:t xml:space="preserve"> </w:t>
       </w:r>
-      <w:r>
-        <w:t xml:space="preserve"> this </w:t>
-      </w:r>
-      <w:r>
-        <w:t>question</w:t>
-      </w:r>
-      <w:r>
-        <w:t xml:space="preserve"> is decomposed into concepts and</w:t>
-      </w:r>
-      <w:r>
-        <w:t xml:space="preserve"> keywords that will help </w:t>
-      </w:r>
-      <w:r>
-        <w:t>constru</w:t>
-      </w:r>
-      <w:r>
-        <w:t>ct</w:t>
-      </w:r>
-      <w:r>
-        <w:t xml:space="preserve"> the </w:t>
-      </w:r>
-      <w:r>
-        <w:t>string</w:t>
-      </w:r>
-      <w:r>
-        <w:t xml:space="preserve"> search</w:t>
-      </w:r>
-      <w:r>
-        <w:t xml:space="preserve">. </w:t>
-      </w:r>
-      <w:r>
-        <w:t xml:space="preserve">Then </w:t>
-      </w:r>
-      <w:r>
-        <w:t>it</w:t>
-      </w:r>
-      <w:r>
-        <w:t xml:space="preserve"> </w:t>
-      </w:r>
-      <w:r>
-        <w:t>shows</w:t>
-      </w:r>
-      <w:r>
-        <w:t xml:space="preserve"> the database selection followed by the research strategy</w:t>
-      </w:r>
-      <w:r>
-        <w:t xml:space="preserve"> that </w:t>
-      </w:r>
-      <w:r>
-        <w:t>c</w:t>
-      </w:r>
-      <w:r>
-        <w:t xml:space="preserve">ontains the </w:t>
-      </w:r>
-      <w:r>
-        <w:t>search</w:t>
-      </w:r>
-      <w:r>
-        <w:t xml:space="preserve"> statement</w:t>
-      </w:r>
-      <w:r>
-        <w:t xml:space="preserve"> add its </w:t>
-      </w:r>
-      <w:r>
-        <w:t>findings</w:t>
-      </w:r>
-      <w:r>
-        <w:t>.</w:t>
-      </w:r>
-      <w:r>
-        <w:t xml:space="preserve"> </w:t>
-      </w:r>
-      <w:r>
-        <w:t xml:space="preserve"> </w:t>
-      </w:r>
-      <w:r>
-        <w:t>Afterwards,</w:t>
-      </w:r>
-      <w:r>
-        <w:t xml:space="preserve"> it will present the </w:t>
-      </w:r>
-      <w:r>
-        <w:t>Information management strategy</w:t>
-      </w:r>
-      <w:r>
-        <w:t xml:space="preserve"> follow</w:t>
-      </w:r>
-      <w:r>
-        <w:t>ed by</w:t>
-      </w:r>
-      <w:r>
-        <w:t xml:space="preserve"> the current awareness strategy</w:t>
-      </w:r>
-      <w:r>
-        <w:t xml:space="preserve"> </w:t>
-      </w:r>
-      <w:r>
-        <w:t xml:space="preserve">where </w:t>
-      </w:r>
-      <w:r>
-        <w:t>the</w:t>
-      </w:r>
-      <w:r>
-        <w:t xml:space="preserve"> document will show how to keep the </w:t>
-      </w:r>
-      <w:r>
-        <w:t>r</w:t>
-      </w:r>
-      <w:r>
-        <w:t>esearcher updated with the latest development in its field</w:t>
-      </w:r>
-      <w:r>
-        <w:t>.</w:t>
-      </w:r>
-      <w:r>
-        <w:t xml:space="preserve"> </w:t>
-      </w:r>
-      <w:r>
-        <w:t>F</w:t>
-      </w:r>
-      <w:r>
-        <w:t>inally</w:t>
-      </w:r>
-      <w:r>
-        <w:t>,</w:t>
-      </w:r>
-      <w:r>
-        <w:t xml:space="preserve"> he will move to the analysis of some </w:t>
-      </w:r>
-      <w:r>
-        <w:t xml:space="preserve">sources, </w:t>
-      </w:r>
-      <w:r>
-        <w:t>in</w:t>
-      </w:r>
-      <w:r>
-        <w:t xml:space="preserve"> this section </w:t>
-      </w:r>
-      <w:r>
-        <w:t xml:space="preserve">three </w:t>
-      </w:r>
-      <w:r>
-        <w:t xml:space="preserve"> provided sources will be analysed for authenticity</w:t>
-      </w:r>
-      <w:r>
-        <w:t xml:space="preserve"> </w:t>
-      </w:r>
-      <w:r>
-        <w:t>a</w:t>
-      </w:r>
-      <w:r>
-        <w:t>nd other important aspects</w:t>
-      </w:r>
-      <w:r>
-        <w:t xml:space="preserve"> </w:t>
-      </w:r>
-      <w:r>
-        <w:t>t</w:t>
-      </w:r>
-      <w:r>
-        <w:t>hat are part of any academic researcher's life</w:t>
-      </w:r>
-      <w:r>
-        <w:t xml:space="preserve"> when handling </w:t>
-      </w:r>
-      <w:r>
-        <w:t>sources and references.</w:t>
-      </w:r>
-    </w:p>
-    <w:p>
-      <w:pPr>
-        <w:pStyle w:val="Heading2"/>
+    </w:p>
+    <w:p>
+      <w:r>
+        <w:t xml:space="preserve">To build a structured search string, the research question is deconstructed into research concepts. These concepts are </w:t>
+      </w:r>
+      <w:r>
+        <w:t>taken apart</w:t>
+      </w:r>
+      <w:r>
+        <w:t xml:space="preserve"> further into keywords. The research concepts that were found in this question are the following:</w:t>
+      </w:r>
+    </w:p>
+    <w:p>
+      <w:pPr>
+        <w:pStyle w:val="ListParagraph"/>
         <w:numPr>
           <w:ilvl w:val="0"/>
+          <w:numId w:val="14"/>
+        </w:numPr>
+      </w:pPr>
+      <w:r>
+        <w:t>MARL simulation.</w:t>
+      </w:r>
+    </w:p>
+    <w:p>
+      <w:pPr>
+        <w:pStyle w:val="ListParagraph"/>
+        <w:numPr>
+          <w:ilvl w:val="0"/>
+          <w:numId w:val="14"/>
+        </w:numPr>
+      </w:pPr>
+      <w:r>
+        <w:t>Parametric preference vectors.</w:t>
+      </w:r>
+    </w:p>
+    <w:p>
+      <w:pPr>
+        <w:pStyle w:val="ListParagraph"/>
+        <w:numPr>
+          <w:ilvl w:val="0"/>
+          <w:numId w:val="14"/>
+        </w:numPr>
+      </w:pPr>
+      <w:r>
+        <w:t>Consensus output prediction.</w:t>
+      </w:r>
+    </w:p>
+    <w:p>
+      <w:r>
+        <w:t xml:space="preserve">Three research concepts span three different fields that define the scope of the literature search. The first one is computer science, </w:t>
+      </w:r>
+      <w:r>
+        <w:t>e.g</w:t>
+      </w:r>
+      <w:r>
+        <w:t xml:space="preserve">., deep learning. The second one is game theory and negotiation theory. And the third one is consensus dynamics and prediction, which belong to a </w:t>
+      </w:r>
+      <w:r>
+        <w:t>broader</w:t>
+      </w:r>
+      <w:r>
+        <w:t xml:space="preserve"> area</w:t>
+      </w:r>
+      <w:r>
+        <w:t xml:space="preserve"> of</w:t>
+      </w:r>
+      <w:r>
+        <w:t xml:space="preserve"> </w:t>
+      </w:r>
+      <w:r>
+        <w:t>decision science</w:t>
+      </w:r>
+      <w:r>
+        <w:t>.</w:t>
+      </w:r>
+    </w:p>
+    <w:p>
+      <w:r>
+        <w:lastRenderedPageBreak/>
+        <w:t xml:space="preserve">In the following section, the document shows a set of synonyms, related terms, and keywords that </w:t>
+      </w:r>
+      <w:r>
+        <w:t>are</w:t>
+      </w:r>
+      <w:r>
+        <w:t xml:space="preserve"> used for the search string in the database.</w:t>
+      </w:r>
+    </w:p>
+    <w:p>
+      <w:pPr>
+        <w:pStyle w:val="Heading3"/>
+        <w:numPr>
+          <w:ilvl w:val="1"/>
           <w:numId w:val="5"/>
         </w:numPr>
       </w:pPr>
-      <w:bookmarkStart w:id="1" w:name="_Toc1569493088"/>
-      <w:r>
-        <w:t>Research question</w:t>
-      </w:r>
-      <w:bookmarkEnd w:id="1"/>
+      <w:bookmarkStart w:id="4" w:name="_Toc1504867220"/>
+      <w:r>
+        <w:t>Keywords, synonyms and related terms</w:t>
+      </w:r>
+      <w:bookmarkEnd w:id="4"/>
       <w:r>
         <w:t xml:space="preserve"> </w:t>
       </w:r>
     </w:p>
     <w:p>
-      <w:pPr>
-        <w:pStyle w:val="Heading3"/>
-      </w:pPr>
-      <w:bookmarkStart w:id="2" w:name="_Toc1120900347"/>
-      <w:r>
-        <w:t xml:space="preserve">Research </w:t>
-      </w:r>
-      <w:r>
-        <w:t>q</w:t>
-      </w:r>
-      <w:r>
-        <w:t>uestion</w:t>
-      </w:r>
-      <w:bookmarkEnd w:id="2"/>
+      <w:r>
+        <w:t>To</w:t>
+      </w:r>
+      <w:r>
+        <w:t xml:space="preserve"> find </w:t>
+      </w:r>
+      <w:r>
+        <w:t xml:space="preserve">the </w:t>
+      </w:r>
+      <w:r>
+        <w:t xml:space="preserve">synonyms and related terms that researchers </w:t>
+      </w:r>
+      <w:r>
+        <w:t>use when</w:t>
+      </w:r>
       <w:r>
         <w:t xml:space="preserve"> </w:t>
       </w:r>
       <w:r>
-        <w:t xml:space="preserve"> </w:t>
-      </w:r>
-    </w:p>
-    <w:p>
-      <w:r>
-        <w:t xml:space="preserve"> </w:t>
-      </w:r>
-      <w:r>
-        <w:t>T</w:t>
-      </w:r>
-      <w:r>
-        <w:t>he following</w:t>
-      </w:r>
-      <w:r>
-        <w:t xml:space="preserve"> </w:t>
-      </w:r>
-      <w:r>
-        <w:t>Research equations</w:t>
-      </w:r>
-      <w:r>
-        <w:t xml:space="preserve"> is the third question of a set of three </w:t>
-      </w:r>
-      <w:r>
-        <w:t>t</w:t>
-      </w:r>
-      <w:r>
-        <w:t xml:space="preserve">hat </w:t>
-      </w:r>
-      <w:r>
-        <w:t>is</w:t>
-      </w:r>
-      <w:r>
-        <w:t xml:space="preserve"> part of my research project</w:t>
-      </w:r>
-      <w:r>
-        <w:t>,</w:t>
-      </w:r>
-      <w:r>
-        <w:t xml:space="preserve"> for the purpose of this document only the third one will be analysed</w:t>
-      </w:r>
-    </w:p>
-    <w:p>
-      <w:pPr>
-        <w:jc w:val="both"/>
-      </w:pPr>
-      <w:r>
-        <w:t xml:space="preserve">Research question: </w:t>
-      </w:r>
-      <w:r>
-        <w:t>How to build a MARL simulation, parametrized by preference vectors, to predict consensus output?</w:t>
-      </w:r>
-    </w:p>
-    <w:p>
-      <w:pPr>
-        <w:jc w:val="both"/>
-      </w:pPr>
-      <w:r>
-        <w:t xml:space="preserve">These projects </w:t>
-      </w:r>
-      <w:r>
-        <w:t>use</w:t>
-      </w:r>
-      <w:r>
-        <w:t xml:space="preserve"> natural language processing to analyse</w:t>
-      </w:r>
-      <w:r>
-        <w:t xml:space="preserve"> diplomatic text </w:t>
-      </w:r>
-      <w:r>
-        <w:t>that has been</w:t>
-      </w:r>
-      <w:r>
-        <w:t xml:space="preserve"> submitted </w:t>
-      </w:r>
-      <w:r>
-        <w:t xml:space="preserve">to </w:t>
-      </w:r>
-      <w:r>
-        <w:t xml:space="preserve">The Antarctic treaty consultative meetings </w:t>
-      </w:r>
-      <w:r>
-        <w:t>(ATCM)</w:t>
-      </w:r>
-      <w:r>
-        <w:t xml:space="preserve"> that </w:t>
-      </w:r>
-      <w:r>
-        <w:t>take place</w:t>
-      </w:r>
-      <w:r>
-        <w:t xml:space="preserve"> every year</w:t>
+        <w:t>publishing relevant</w:t>
+      </w:r>
+      <w:r>
+        <w:t xml:space="preserve"> studies </w:t>
+      </w:r>
+      <w:r>
+        <w:t>to our literature review, the</w:t>
+      </w:r>
+      <w:r>
+        <w:t xml:space="preserve"> research concepts are </w:t>
+      </w:r>
+      <w:r>
+        <w:t>deconstructed</w:t>
+      </w:r>
+      <w:r>
+        <w:t xml:space="preserve"> into keywords. These keywords are the second column in Table 1. The first column shows the concept that these keywords were derived from, </w:t>
+      </w:r>
+      <w:r>
+        <w:t>and the third</w:t>
+      </w:r>
+      <w:r>
+        <w:t xml:space="preserve"> and fourth</w:t>
+      </w:r>
+      <w:r>
+        <w:t xml:space="preserve"> column</w:t>
+      </w:r>
+      <w:r>
+        <w:t>s</w:t>
+      </w:r>
+      <w:r>
+        <w:t xml:space="preserve"> show the related terms or synonyms</w:t>
+      </w:r>
+      <w:r>
+        <w:t xml:space="preserve"> that will be used for our literature search</w:t>
       </w:r>
       <w:r>
         <w:t>.</w:t>
       </w:r>
-      <w:r>
-        <w:t xml:space="preserve"> </w:t>
-      </w:r>
-      <w:r>
-        <w:t xml:space="preserve">The first and second part of this project contain two questions that are focused on extracting, out of the diplomatic text, the positions or vectors of different countries throughout the history of the ATCNs. Then these vectors are the </w:t>
-      </w:r>
-      <w:r>
-        <w:t>parametric</w:t>
-      </w:r>
-      <w:r>
-        <w:t xml:space="preserve"> </w:t>
-      </w:r>
-      <w:r>
-        <w:t>vectors</w:t>
-      </w:r>
-      <w:r>
-        <w:t>,</w:t>
-      </w:r>
-      <w:r>
-        <w:t xml:space="preserve"> </w:t>
-      </w:r>
-      <w:r>
-        <w:t>i</w:t>
-      </w:r>
-      <w:r>
-        <w:t>n the question above, are used to build a multi-agent reinforcement learning</w:t>
-      </w:r>
-      <w:r>
-        <w:t xml:space="preserve"> (MARL)</w:t>
-      </w:r>
-      <w:r>
-        <w:t xml:space="preserve"> simulation, to match the historic outputs of the A</w:t>
-      </w:r>
-      <w:r>
-        <w:t>T</w:t>
-      </w:r>
-      <w:r>
-        <w:t xml:space="preserve">CM, and then </w:t>
-      </w:r>
-      <w:r>
-        <w:t>predict</w:t>
-      </w:r>
-      <w:r>
-        <w:t xml:space="preserve"> the outputs of future ATCMs, which happens to decide everything </w:t>
-      </w:r>
-      <w:r>
-        <w:t>through</w:t>
-      </w:r>
-      <w:r>
-        <w:t xml:space="preserve"> consensus.</w:t>
-      </w:r>
-      <w:r>
-        <w:t xml:space="preserve"> </w:t>
-      </w:r>
-      <w:r>
-        <w:t xml:space="preserve"> </w:t>
-      </w:r>
-    </w:p>
-    <w:p>
-      <w:pPr>
-        <w:pStyle w:val="Heading3"/>
-      </w:pPr>
-      <w:bookmarkStart w:id="3" w:name="_Toc953919908"/>
-      <w:r>
-        <w:t xml:space="preserve">Research </w:t>
-      </w:r>
-      <w:r>
-        <w:t>c</w:t>
-      </w:r>
-      <w:r>
-        <w:t>oncepts</w:t>
-      </w:r>
-      <w:bookmarkEnd w:id="3"/>
-      <w:r>
-        <w:t xml:space="preserve"> </w:t>
-      </w:r>
-    </w:p>
-    <w:p>
-      <w:pPr>
-        <w:pStyle w:val="font-claude-response-body"/>
-      </w:pPr>
-      <w:r>
-        <w:t>To</w:t>
-      </w:r>
-      <w:r>
-        <w:t xml:space="preserve"> build </w:t>
-      </w:r>
-      <w:r>
-        <w:t>a</w:t>
-      </w:r>
-      <w:r>
-        <w:t xml:space="preserve"> structured search </w:t>
-      </w:r>
-      <w:r>
-        <w:t>string,</w:t>
-      </w:r>
-      <w:r>
-        <w:t xml:space="preserve"> the research question is deconstructed into research concepts. These concepts are deconstructed further into keywords. </w:t>
-      </w:r>
-    </w:p>
-    <w:p>
-      <w:pPr>
-        <w:pStyle w:val="font-claude-response-body"/>
-      </w:pPr>
-      <w:r>
-        <w:t xml:space="preserve">The research concepts that were found in </w:t>
-      </w:r>
-      <w:r>
-        <w:t>this</w:t>
-      </w:r>
-      <w:r>
-        <w:t xml:space="preserve"> question are the following:</w:t>
-      </w:r>
-    </w:p>
-    <w:p>
-      <w:pPr>
-        <w:pStyle w:val="font-claude-response-body"/>
-        <w:numPr>
-          <w:ilvl w:val="0"/>
-          <w:numId w:val="9"/>
-        </w:numPr>
-      </w:pPr>
-      <w:r>
-        <w:t>MARL simulation</w:t>
-      </w:r>
-      <w:r>
-        <w:t>.</w:t>
-      </w:r>
-    </w:p>
-    <w:p>
-      <w:pPr>
-        <w:pStyle w:val="font-claude-response-body"/>
-        <w:numPr>
-          <w:ilvl w:val="0"/>
-          <w:numId w:val="9"/>
-        </w:numPr>
-      </w:pPr>
-      <w:r>
-        <w:t>P</w:t>
-      </w:r>
-      <w:r>
-        <w:t>arametri</w:t>
-      </w:r>
-      <w:r>
-        <w:t>c</w:t>
-      </w:r>
-      <w:r>
-        <w:t xml:space="preserve"> preference vectors</w:t>
-      </w:r>
-      <w:r>
-        <w:t>.</w:t>
-      </w:r>
-    </w:p>
-    <w:p>
-      <w:pPr>
-        <w:pStyle w:val="font-claude-response-body"/>
-        <w:numPr>
-          <w:ilvl w:val="0"/>
-          <w:numId w:val="9"/>
-        </w:numPr>
-      </w:pPr>
-      <w:r>
-        <w:t>C</w:t>
-      </w:r>
-      <w:r>
-        <w:t>onsensus output</w:t>
-      </w:r>
-      <w:r>
-        <w:t xml:space="preserve"> prediction.</w:t>
-      </w:r>
-    </w:p>
-    <w:p>
-      <w:r>
-        <w:t xml:space="preserve">Three research concepts spanned three different fields that define the scope of the literature search. The first one is computer science, i.e., deep learning. The second one </w:t>
-      </w:r>
-      <w:r>
-        <w:lastRenderedPageBreak/>
-        <w:t>is game theory and negotiation theory. And the third one is consensus dynamics and prediction, which belong to a bigger area, which is international relations</w:t>
-      </w:r>
-      <w:r>
-        <w:t xml:space="preserve">. </w:t>
-      </w:r>
-    </w:p>
-    <w:p>
-      <w:r>
-        <w:t>Following section, the document shows a set of synonyms, related terms, and keywords that will be used for the search string in the database.</w:t>
-      </w:r>
-    </w:p>
-    <w:p>
-      <w:pPr>
-        <w:pStyle w:val="Heading3"/>
-      </w:pPr>
-      <w:bookmarkStart w:id="4" w:name="_Toc1504867220"/>
-      <w:r>
-        <w:t>Keywords, synonyms and related terms</w:t>
-      </w:r>
-      <w:bookmarkEnd w:id="4"/>
-      <w:r>
-        <w:t xml:space="preserve"> </w:t>
-      </w:r>
-    </w:p>
-    <w:p>
-      <w:r>
-        <w:t>I</w:t>
-      </w:r>
-      <w:r>
-        <w:t xml:space="preserve">n order to find synonyms and related terms that may be used by researchers when publishing studies that are </w:t>
-      </w:r>
-      <w:r>
-        <w:t>relevant</w:t>
-      </w:r>
-      <w:r>
-        <w:t xml:space="preserve"> to our literature review, </w:t>
-      </w:r>
-      <w:r>
-        <w:t>the research concept is</w:t>
-      </w:r>
-      <w:r>
-        <w:t xml:space="preserve"> decomposed into keywords. These keywords are the second column in table </w:t>
-      </w:r>
-      <w:r>
+    </w:p>
+    <w:p>
+      <w:pPr>
+        <w:pStyle w:val="Caption"/>
+        <w:keepNext/>
+      </w:pPr>
+      <w:r>
+        <w:t xml:space="preserve">Table </w:t>
+      </w:r>
+      <w:r>
+        <w:fldChar w:fldCharType="begin"/>
+      </w:r>
+      <w:r>
+        <w:instrText xml:space="preserve"> SEQ Table \* ARABIC </w:instrText>
+      </w:r>
+      <w:r>
+        <w:fldChar w:fldCharType="separate"/>
+      </w:r>
+      <w:r>
+        <w:rPr>
+          <w:noProof/>
+        </w:rPr>
         <w:t>1</w:t>
       </w:r>
       <w:r>
-        <w:t xml:space="preserve">. The first column shows the concept that these keywords were derived from, and the third column shows the related terms or synonyms that </w:t>
-      </w:r>
-      <w:r>
-        <w:t xml:space="preserve">will be </w:t>
-      </w:r>
-      <w:r>
-        <w:t>use</w:t>
-      </w:r>
-      <w:r>
-        <w:t>d</w:t>
-      </w:r>
-      <w:r>
-        <w:t xml:space="preserve"> for our </w:t>
-      </w:r>
-      <w:r>
-        <w:t xml:space="preserve">literature </w:t>
-      </w:r>
-      <w:r>
-        <w:t>search</w:t>
-      </w:r>
-      <w:r>
-        <w:t>.</w:t>
+        <w:fldChar w:fldCharType="end"/>
+      </w:r>
+      <w:r>
+        <w:t>. Keywords</w:t>
       </w:r>
     </w:p>
     <w:tbl>
@@ -2929,7 +2799,15 @@
         <w:t xml:space="preserve">and truncations for the words that are common with variation, for example, </w:t>
       </w:r>
       <w:r>
-        <w:t>“reinforc*” which can take the form of “reinforcement”</w:t>
+        <w:t>“</w:t>
+      </w:r>
+      <w:proofErr w:type="spellStart"/>
+      <w:r>
+        <w:t>reinforc</w:t>
+      </w:r>
+      <w:proofErr w:type="spellEnd"/>
+      <w:r>
+        <w:t>*” which can take the form of “reinforcement”</w:t>
       </w:r>
       <w:r>
         <w:t xml:space="preserve"> or “reinforced”.</w:t>
@@ -2951,7 +2829,63 @@
     </w:p>
     <w:p>
       <w:r>
-        <w:t>TITLE-ABS-KEY ( "multi agent reinforcement learning" OR "multiagent reinforcement learning" OR marl OR "decentrali?ed reinforcement learning" OR "stochastic game*" OR "markov game*" OR "agent based simulat*" ) AND ALL ( "preference vector*" OR "preference weight*" OR "weight vector*" OR "preference condition*" OR "multi objective reinforcement learning" OR morl OR scalari?ation OR "reward weight*" ) AND ALL ( consensus OR "collective decision*" OR "group decision*" OR "emergent agreement" OR "joint policy" OR "joint policies" OR "policy aggregation" OR coordinat* OR "social welfare" ) AND ( LIMIT-TO ( SRCTYPE , "j" ) ) AND ( LIMIT-TO ( DOCTYPE , "ar" ) OR LIMIT-TO ( DOCTYPE , "re" ) )</w:t>
+        <w:t>TITLE-ABS-KEY ( "multi agent reinforcement learning" OR "multiagent reinforcement learning" OR marl OR "</w:t>
+      </w:r>
+      <w:proofErr w:type="spellStart"/>
+      <w:r>
+        <w:t>decentrali?ed</w:t>
+      </w:r>
+      <w:proofErr w:type="spellEnd"/>
+      <w:r>
+        <w:t xml:space="preserve"> reinforcement learning" OR "stochastic game*" OR "</w:t>
+      </w:r>
+      <w:proofErr w:type="spellStart"/>
+      <w:r>
+        <w:t>markov</w:t>
+      </w:r>
+      <w:proofErr w:type="spellEnd"/>
+      <w:r>
+        <w:t xml:space="preserve"> game*" OR "agent based </w:t>
+      </w:r>
+      <w:proofErr w:type="spellStart"/>
+      <w:r>
+        <w:t>simulat</w:t>
+      </w:r>
+      <w:proofErr w:type="spellEnd"/>
+      <w:r>
+        <w:t xml:space="preserve">*" ) AND ALL ( "preference vector*" OR "preference weight*" OR "weight vector*" OR "preference condition*" OR "multi objective reinforcement learning" OR </w:t>
+      </w:r>
+      <w:proofErr w:type="spellStart"/>
+      <w:r>
+        <w:t>morl</w:t>
+      </w:r>
+      <w:proofErr w:type="spellEnd"/>
+      <w:r>
+        <w:t xml:space="preserve"> OR </w:t>
+      </w:r>
+      <w:proofErr w:type="spellStart"/>
+      <w:r>
+        <w:t>scalari?ation</w:t>
+      </w:r>
+      <w:proofErr w:type="spellEnd"/>
+      <w:r>
+        <w:t xml:space="preserve"> OR "reward weight*" ) AND ALL ( consensus OR "collective decision*" OR "group decision*" OR "emergent agreement" OR "joint policy" OR "joint policies" OR "policy aggregation" OR </w:t>
+      </w:r>
+      <w:proofErr w:type="spellStart"/>
+      <w:r>
+        <w:t>coordinat</w:t>
+      </w:r>
+      <w:proofErr w:type="spellEnd"/>
+      <w:r>
+        <w:t>* OR "social welfare" ) AND ( LIMIT-TO ( SRCTYPE , "j" ) ) AND ( LIMIT-TO ( DOCTYPE , "</w:t>
+      </w:r>
+      <w:proofErr w:type="spellStart"/>
+      <w:r>
+        <w:t>ar</w:t>
+      </w:r>
+      <w:proofErr w:type="spellEnd"/>
+      <w:r>
+        <w:t>" ) OR LIMIT-TO ( DOCTYPE , "re" ) )</w:t>
       </w:r>
     </w:p>
     <w:p>
@@ -3034,7 +2968,15 @@
     </w:p>
     <w:p>
       <w:r>
-        <w:t xml:space="preserve">The final research statement is build iteratively, starting from the most restrictive search and the expanding it to a reasonable number of results. The first </w:t>
+        <w:t xml:space="preserve">The final research statement is </w:t>
+      </w:r>
+      <w:proofErr w:type="gramStart"/>
+      <w:r>
+        <w:t>build</w:t>
+      </w:r>
+      <w:proofErr w:type="gramEnd"/>
+      <w:r>
+        <w:t xml:space="preserve"> iteratively, starting from the most restrictive search and the expanding it to a reasonable number of results. The first </w:t>
       </w:r>
       <w:r>
         <w:t>research statement outputs only th</w:t>
@@ -3085,11 +3027,16 @@
       <w:r>
         <w:t xml:space="preserve">research concepts, the most restricted one is consensus. That is because, usually, computer science and mathematics are interrelated, and they show up in several resources together. That is because computer science uses mathematical innovations to work, </w:t>
       </w:r>
+      <w:proofErr w:type="gramStart"/>
       <w:r>
         <w:t>and</w:t>
       </w:r>
       <w:r>
-        <w:t>, sometimes mathematicians use computers to</w:t>
+        <w:t>,</w:t>
+      </w:r>
+      <w:proofErr w:type="gramEnd"/>
+      <w:r>
+        <w:t xml:space="preserve"> sometimes mathematicians use computers to</w:t>
       </w:r>
       <w:r>
         <w:t xml:space="preserve"> compute numbers</w:t>
@@ -3233,9 +3180,11 @@
         <w:lastRenderedPageBreak/>
         <w:t xml:space="preserve">this third concept represents. If it happens to be true, it means that we need to revisit the research concept to try to find better terms in the consensus part. The hypothesis is that maybe the third concept, with its keywords, related terms, and synonyms, are not </w:t>
       </w:r>
+      <w:proofErr w:type="spellStart"/>
       <w:r>
         <w:t>fraimed</w:t>
       </w:r>
+      <w:proofErr w:type="spellEnd"/>
       <w:r>
         <w:t xml:space="preserve"> well.</w:t>
       </w:r>
@@ -3264,7 +3213,15 @@
         <w:t xml:space="preserve"> the expansion of the results to </w:t>
       </w:r>
       <w:r>
-        <w:t>77. This confirms the hypothesis about Consencus term being the restrictive factor.</w:t>
+        <w:t xml:space="preserve">77. This confirms the hypothesis about </w:t>
+      </w:r>
+      <w:proofErr w:type="spellStart"/>
+      <w:r>
+        <w:t>Consencus</w:t>
+      </w:r>
+      <w:proofErr w:type="spellEnd"/>
+      <w:r>
+        <w:t xml:space="preserve"> term being the restrictive factor.</w:t>
       </w:r>
       <w:r>
         <w:br/>
@@ -3862,7 +3819,15 @@
     </w:p>
     <w:p>
       <w:r>
-        <w:t>The criteria that is used to evaluate the results is the following: First, it will start with the quality of the results. Second, it will evaluate the scope of the results. And third, it will evaluate if the results belong to the disciplines that are relevant to the research question and the project itself.</w:t>
+        <w:t xml:space="preserve">The criteria that </w:t>
+      </w:r>
+      <w:proofErr w:type="gramStart"/>
+      <w:r>
+        <w:t>is</w:t>
+      </w:r>
+      <w:proofErr w:type="gramEnd"/>
+      <w:r>
+        <w:t xml:space="preserve"> used to evaluate the results is the following: First, it will start with the quality of the results. Second, it will evaluate the scope of the results. And third, it will evaluate if the results belong to the disciplines that are relevant to the research question and the project itself.</w:t>
       </w:r>
     </w:p>
     <w:p>
@@ -3894,8 +3859,13 @@
         <w:t xml:space="preserve">The years of publication </w:t>
       </w:r>
       <w:r>
-        <w:t>range from 2017 to 2026,</w:t>
-      </w:r>
+        <w:t xml:space="preserve">range from 2017 to </w:t>
+      </w:r>
+      <w:proofErr w:type="gramStart"/>
+      <w:r>
+        <w:t>2026,</w:t>
+      </w:r>
+      <w:proofErr w:type="gramEnd"/>
       <w:r>
         <w:t xml:space="preserve"> </w:t>
       </w:r>
@@ -3933,7 +3903,15 @@
         <w:t xml:space="preserve">, in the research labs. And this matches the </w:t>
       </w:r>
       <w:r>
-        <w:t xml:space="preserve">dates of  publication of </w:t>
+        <w:t xml:space="preserve">dates </w:t>
+      </w:r>
+      <w:proofErr w:type="gramStart"/>
+      <w:r>
+        <w:t>of  publication</w:t>
+      </w:r>
+      <w:proofErr w:type="gramEnd"/>
+      <w:r>
+        <w:t xml:space="preserve"> of </w:t>
       </w:r>
       <w:r>
         <w:t xml:space="preserve">the </w:t>
@@ -3965,7 +3943,15 @@
         <w:t xml:space="preserve"> and</w:t>
       </w:r>
       <w:r>
-        <w:t xml:space="preserve"> decision science, which are actually the core of </w:t>
+        <w:t xml:space="preserve"> decision science, which are </w:t>
+      </w:r>
+      <w:proofErr w:type="gramStart"/>
+      <w:r>
+        <w:t>actually the</w:t>
+      </w:r>
+      <w:proofErr w:type="gramEnd"/>
+      <w:r>
+        <w:t xml:space="preserve"> core of </w:t>
       </w:r>
       <w:r>
         <w:t>the</w:t>
@@ -4097,10 +4083,26 @@
         <w:t xml:space="preserve"> filtered by reading the title, abstract and keywords</w:t>
       </w:r>
       <w:r>
-        <w:t xml:space="preserve"> first, this discard some of the irrelevant ones. Subsiquently, </w:t>
-      </w:r>
-      <w:r>
-        <w:t xml:space="preserve">the selected list of articles are input into </w:t>
+        <w:t xml:space="preserve"> first, this discard some of the irrelevant ones. </w:t>
+      </w:r>
+      <w:proofErr w:type="spellStart"/>
+      <w:r>
+        <w:t>Subsiquently</w:t>
+      </w:r>
+      <w:proofErr w:type="spellEnd"/>
+      <w:r>
+        <w:t xml:space="preserve">, </w:t>
+      </w:r>
+      <w:r>
+        <w:t xml:space="preserve">the selected list of articles </w:t>
+      </w:r>
+      <w:proofErr w:type="gramStart"/>
+      <w:r>
+        <w:t>are</w:t>
+      </w:r>
+      <w:proofErr w:type="gramEnd"/>
+      <w:r>
+        <w:t xml:space="preserve"> input into </w:t>
       </w:r>
       <w:r>
         <w:t xml:space="preserve">Zotero, including the actual pdf. During this step all type of </w:t>
@@ -4152,10 +4154,34 @@
         <w:t>For storing and organizing literature Zotero software is being used</w:t>
       </w:r>
       <w:r>
-        <w:t xml:space="preserve"> to Store medata (title, abstract, authord, DOI etc) and the pdf itself.</w:t>
-      </w:r>
-      <w:r>
-        <w:t xml:space="preserve"> The syncing Zotero feature is disable in order to prevent </w:t>
+        <w:t xml:space="preserve"> to Store </w:t>
+      </w:r>
+      <w:proofErr w:type="spellStart"/>
+      <w:r>
+        <w:t>medata</w:t>
+      </w:r>
+      <w:proofErr w:type="spellEnd"/>
+      <w:r>
+        <w:t xml:space="preserve"> (title, abstract, </w:t>
+      </w:r>
+      <w:proofErr w:type="spellStart"/>
+      <w:r>
+        <w:t>authord</w:t>
+      </w:r>
+      <w:proofErr w:type="spellEnd"/>
+      <w:r>
+        <w:t>, DOI etc) and the pdf itself.</w:t>
+      </w:r>
+      <w:r>
+        <w:t xml:space="preserve"> The syncing Zotero feature is disable </w:t>
+      </w:r>
+      <w:proofErr w:type="gramStart"/>
+      <w:r>
+        <w:t>in order to</w:t>
+      </w:r>
+      <w:proofErr w:type="gramEnd"/>
+      <w:r>
+        <w:t xml:space="preserve"> prevent </w:t>
       </w:r>
       <w:r>
         <w:t>the pdf being uploaded to unwanted server.</w:t>
@@ -4220,11 +4246,24 @@
       <w:r>
         <w:t xml:space="preserve"> using it </w:t>
       </w:r>
-      <w:r>
-        <w:t xml:space="preserve">pluging to Word text editor. This allows the direct referencing of in-text </w:t>
-      </w:r>
-      <w:r>
-        <w:t xml:space="preserve"> citations directly from Zotero</w:t>
+      <w:proofErr w:type="spellStart"/>
+      <w:r>
+        <w:t>pluging</w:t>
+      </w:r>
+      <w:proofErr w:type="spellEnd"/>
+      <w:r>
+        <w:t xml:space="preserve"> to Word text editor. This allows the direct referencing of in-</w:t>
+      </w:r>
+      <w:proofErr w:type="gramStart"/>
+      <w:r>
+        <w:t xml:space="preserve">text </w:t>
+      </w:r>
+      <w:r>
+        <w:t xml:space="preserve"> citations</w:t>
+      </w:r>
+      <w:proofErr w:type="gramEnd"/>
+      <w:r>
+        <w:t xml:space="preserve"> directly from Zotero</w:t>
       </w:r>
       <w:r>
         <w:t>. Since, all articles are imported directly from Scopus</w:t>
@@ -4272,7 +4311,15 @@
         <w:t xml:space="preserve">the tracking every search with its results and </w:t>
       </w:r>
       <w:r>
-        <w:t xml:space="preserve">date. Furthermore, in case of extra comments need to added a </w:t>
+        <w:t xml:space="preserve">date. Furthermore, in case of extra comments need to </w:t>
+      </w:r>
+      <w:proofErr w:type="gramStart"/>
+      <w:r>
+        <w:t>added</w:t>
+      </w:r>
+      <w:proofErr w:type="gramEnd"/>
+      <w:r>
+        <w:t xml:space="preserve"> a </w:t>
       </w:r>
       <w:r>
         <w:t xml:space="preserve">md file will be kept in </w:t>
@@ -4346,20 +4393,48 @@
     </w:p>
     <w:p>
       <w:r>
-        <w:t xml:space="preserve">In Artificial Intelligence related field the advace and </w:t>
+        <w:t xml:space="preserve">In Artificial Intelligence related </w:t>
+      </w:r>
+      <w:proofErr w:type="gramStart"/>
+      <w:r>
+        <w:t>field</w:t>
+      </w:r>
+      <w:proofErr w:type="gramEnd"/>
+      <w:r>
+        <w:t xml:space="preserve"> the </w:t>
+      </w:r>
+      <w:proofErr w:type="spellStart"/>
+      <w:r>
+        <w:t>advace</w:t>
+      </w:r>
+      <w:proofErr w:type="spellEnd"/>
+      <w:r>
+        <w:t xml:space="preserve"> and </w:t>
       </w:r>
       <w:r>
         <w:t xml:space="preserve">of scientific knowledge is staggering in the las decade. This makes </w:t>
       </w:r>
-      <w:r>
-        <w:t xml:space="preserve">a awareness strategy necessary to keep the pace of the </w:t>
-      </w:r>
-      <w:r>
-        <w:t xml:space="preserve">of cutting </w:t>
+      <w:proofErr w:type="spellStart"/>
+      <w:proofErr w:type="gramStart"/>
+      <w:r>
+        <w:t>a</w:t>
+      </w:r>
+      <w:proofErr w:type="spellEnd"/>
+      <w:proofErr w:type="gramEnd"/>
+      <w:r>
+        <w:t xml:space="preserve"> awareness strategy necessary to keep the pace of the </w:t>
+      </w:r>
+      <w:r>
+        <w:t xml:space="preserve">of </w:t>
+      </w:r>
+      <w:proofErr w:type="gramStart"/>
+      <w:r>
+        <w:t xml:space="preserve">cutting </w:t>
       </w:r>
       <w:r>
         <w:t>edge</w:t>
       </w:r>
+      <w:proofErr w:type="gramEnd"/>
       <w:r>
         <w:t xml:space="preserve"> AI science</w:t>
       </w:r>
@@ -4456,9 +4531,11 @@
       <w:r>
         <w:t xml:space="preserve">lead researchers in </w:t>
       </w:r>
+      <w:proofErr w:type="spellStart"/>
       <w:r>
         <w:t>Linkedin</w:t>
       </w:r>
+      <w:proofErr w:type="spellEnd"/>
       <w:r>
         <w:t>.</w:t>
       </w:r>
@@ -4471,7 +4548,15 @@
         <w:t>strategy is to follow the top</w:t>
       </w:r>
       <w:r>
-        <w:t xml:space="preserve"> researchers in this interdisciplinary field. Usually, lead researchers publish in their linkedin pages when new has been released to the public. One of those researchers is </w:t>
+        <w:t xml:space="preserve"> researchers in this interdisciplinary field. Usually, lead researchers publish in their </w:t>
+      </w:r>
+      <w:proofErr w:type="spellStart"/>
+      <w:r>
+        <w:t>linkedin</w:t>
+      </w:r>
+      <w:proofErr w:type="spellEnd"/>
+      <w:r>
+        <w:t xml:space="preserve"> pages when new has been released to the public. One of those researchers is </w:t>
       </w:r>
       <w:r>
         <w:t>Zhen Gao, who is in the author of two of the articles resulting from the search. See figure below.</w:t>
@@ -4591,7 +4676,15 @@
         <w:t xml:space="preserve">In this section three provided references are analysed for </w:t>
       </w:r>
       <w:r>
-        <w:t xml:space="preserve">authenticity following an structured validation strategy. </w:t>
+        <w:t xml:space="preserve">authenticity following </w:t>
+      </w:r>
+      <w:proofErr w:type="gramStart"/>
+      <w:r>
+        <w:t>an</w:t>
+      </w:r>
+      <w:proofErr w:type="gramEnd"/>
+      <w:r>
+        <w:t xml:space="preserve"> structured validation strategy. </w:t>
       </w:r>
       <w:r>
         <w:t xml:space="preserve">For each source a judgement of authenticity is provided and </w:t>
@@ -4606,10 +4699,34 @@
         <w:t xml:space="preserve"> When the source</w:t>
       </w:r>
       <w:r>
-        <w:t xml:space="preserve">’s judgement resolves to “frabricated”, no other criteria is </w:t>
-      </w:r>
-      <w:r>
-        <w:t>used, since, there is not point in continuing.</w:t>
+        <w:t>’s judgement resolves to “</w:t>
+      </w:r>
+      <w:proofErr w:type="spellStart"/>
+      <w:r>
+        <w:t>frabricated</w:t>
+      </w:r>
+      <w:proofErr w:type="spellEnd"/>
+      <w:r>
+        <w:t xml:space="preserve">”, no other criteria is </w:t>
+      </w:r>
+      <w:r>
+        <w:t xml:space="preserve">used, </w:t>
+      </w:r>
+      <w:proofErr w:type="gramStart"/>
+      <w:r>
+        <w:t>since,</w:t>
+      </w:r>
+      <w:proofErr w:type="gramEnd"/>
+      <w:r>
+        <w:t xml:space="preserve"> there is </w:t>
+      </w:r>
+      <w:proofErr w:type="spellStart"/>
+      <w:r>
+        <w:t>not</w:t>
+      </w:r>
+      <w:proofErr w:type="spellEnd"/>
+      <w:r>
+        <w:t xml:space="preserve"> point in continuing.</w:t>
       </w:r>
     </w:p>
     <w:p>
@@ -4963,8 +5080,13 @@
       <w:bookmarkEnd w:id="22"/>
     </w:p>
     <w:p>
-      <w:r>
-        <w:t>Nourizadeh, P., Milford, M., &amp; Fischer, T. (2024, May 13-17). Teach and repeat navigation: A robust control approach</w:t>
+      <w:proofErr w:type="spellStart"/>
+      <w:r>
+        <w:t>Nourizadeh</w:t>
+      </w:r>
+      <w:proofErr w:type="spellEnd"/>
+      <w:r>
+        <w:t>, P., Milford, M., &amp; Fischer, T. (2024, May 13-17). Teach and repeat navigation: A robust control approach</w:t>
       </w:r>
       <w:r>
         <w:t xml:space="preserve"> </w:t>
@@ -6116,6 +6238,119 @@
     </w:lvl>
   </w:abstractNum>
   <w:abstractNum w:abstractNumId="8" w15:restartNumberingAfterBreak="0">
+    <w:nsid w:val="430C6DDB"/>
+    <w:multiLevelType w:val="hybridMultilevel"/>
+    <w:tmpl w:val="91026C5C"/>
+    <w:lvl w:ilvl="0" w:tplc="0C090001">
+      <w:start w:val="1"/>
+      <w:numFmt w:val="bullet"/>
+      <w:lvlText w:val=""/>
+      <w:lvlJc w:val="left"/>
+      <w:pPr>
+        <w:ind w:left="720" w:hanging="360"/>
+      </w:pPr>
+      <w:rPr>
+        <w:rFonts w:ascii="Symbol" w:hAnsi="Symbol" w:hint="default"/>
+      </w:rPr>
+    </w:lvl>
+    <w:lvl w:ilvl="1" w:tplc="0C090003" w:tentative="1">
+      <w:start w:val="1"/>
+      <w:numFmt w:val="bullet"/>
+      <w:lvlText w:val="o"/>
+      <w:lvlJc w:val="left"/>
+      <w:pPr>
+        <w:ind w:left="1440" w:hanging="360"/>
+      </w:pPr>
+      <w:rPr>
+        <w:rFonts w:ascii="Courier New" w:hAnsi="Courier New" w:cs="Courier New" w:hint="default"/>
+      </w:rPr>
+    </w:lvl>
+    <w:lvl w:ilvl="2" w:tplc="0C090005" w:tentative="1">
+      <w:start w:val="1"/>
+      <w:numFmt w:val="bullet"/>
+      <w:lvlText w:val=""/>
+      <w:lvlJc w:val="left"/>
+      <w:pPr>
+        <w:ind w:left="2160" w:hanging="360"/>
+      </w:pPr>
+      <w:rPr>
+        <w:rFonts w:ascii="Wingdings" w:hAnsi="Wingdings" w:hint="default"/>
+      </w:rPr>
+    </w:lvl>
+    <w:lvl w:ilvl="3" w:tplc="0C090001" w:tentative="1">
+      <w:start w:val="1"/>
+      <w:numFmt w:val="bullet"/>
+      <w:lvlText w:val=""/>
+      <w:lvlJc w:val="left"/>
+      <w:pPr>
+        <w:ind w:left="2880" w:hanging="360"/>
+      </w:pPr>
+      <w:rPr>
+        <w:rFonts w:ascii="Symbol" w:hAnsi="Symbol" w:hint="default"/>
+      </w:rPr>
+    </w:lvl>
+    <w:lvl w:ilvl="4" w:tplc="0C090003" w:tentative="1">
+      <w:start w:val="1"/>
+      <w:numFmt w:val="bullet"/>
+      <w:lvlText w:val="o"/>
+      <w:lvlJc w:val="left"/>
+      <w:pPr>
+        <w:ind w:left="3600" w:hanging="360"/>
+      </w:pPr>
+      <w:rPr>
+        <w:rFonts w:ascii="Courier New" w:hAnsi="Courier New" w:cs="Courier New" w:hint="default"/>
+      </w:rPr>
+    </w:lvl>
+    <w:lvl w:ilvl="5" w:tplc="0C090005" w:tentative="1">
+      <w:start w:val="1"/>
+      <w:numFmt w:val="bullet"/>
+      <w:lvlText w:val=""/>
+      <w:lvlJc w:val="left"/>
+      <w:pPr>
+        <w:ind w:left="4320" w:hanging="360"/>
+      </w:pPr>
+      <w:rPr>
+        <w:rFonts w:ascii="Wingdings" w:hAnsi="Wingdings" w:hint="default"/>
+      </w:rPr>
+    </w:lvl>
+    <w:lvl w:ilvl="6" w:tplc="0C090001" w:tentative="1">
+      <w:start w:val="1"/>
+      <w:numFmt w:val="bullet"/>
+      <w:lvlText w:val=""/>
+      <w:lvlJc w:val="left"/>
+      <w:pPr>
+        <w:ind w:left="5040" w:hanging="360"/>
+      </w:pPr>
+      <w:rPr>
+        <w:rFonts w:ascii="Symbol" w:hAnsi="Symbol" w:hint="default"/>
+      </w:rPr>
+    </w:lvl>
+    <w:lvl w:ilvl="7" w:tplc="0C090003" w:tentative="1">
+      <w:start w:val="1"/>
+      <w:numFmt w:val="bullet"/>
+      <w:lvlText w:val="o"/>
+      <w:lvlJc w:val="left"/>
+      <w:pPr>
+        <w:ind w:left="5760" w:hanging="360"/>
+      </w:pPr>
+      <w:rPr>
+        <w:rFonts w:ascii="Courier New" w:hAnsi="Courier New" w:cs="Courier New" w:hint="default"/>
+      </w:rPr>
+    </w:lvl>
+    <w:lvl w:ilvl="8" w:tplc="0C090005" w:tentative="1">
+      <w:start w:val="1"/>
+      <w:numFmt w:val="bullet"/>
+      <w:lvlText w:val=""/>
+      <w:lvlJc w:val="left"/>
+      <w:pPr>
+        <w:ind w:left="6480" w:hanging="360"/>
+      </w:pPr>
+      <w:rPr>
+        <w:rFonts w:ascii="Wingdings" w:hAnsi="Wingdings" w:hint="default"/>
+      </w:rPr>
+    </w:lvl>
+  </w:abstractNum>
+  <w:abstractNum w:abstractNumId="9" w15:restartNumberingAfterBreak="0">
     <w:nsid w:val="5C5F00AA"/>
     <w:multiLevelType w:val="hybridMultilevel"/>
     <w:tmpl w:val="66A676DC"/>
@@ -6228,7 +6463,7 @@
       </w:rPr>
     </w:lvl>
   </w:abstractNum>
-  <w:abstractNum w:abstractNumId="9" w15:restartNumberingAfterBreak="0">
+  <w:abstractNum w:abstractNumId="10" w15:restartNumberingAfterBreak="0">
     <w:nsid w:val="611957B3"/>
     <w:multiLevelType w:val="multilevel"/>
     <w:tmpl w:val="47A858EA"/>
@@ -6377,7 +6612,7 @@
       </w:rPr>
     </w:lvl>
   </w:abstractNum>
-  <w:abstractNum w:abstractNumId="10" w15:restartNumberingAfterBreak="0">
+  <w:abstractNum w:abstractNumId="11" w15:restartNumberingAfterBreak="0">
     <w:nsid w:val="6E963C9C"/>
     <w:multiLevelType w:val="multilevel"/>
     <w:tmpl w:val="0C09001F"/>
@@ -6463,23 +6698,23 @@
       </w:pPr>
     </w:lvl>
   </w:abstractNum>
-  <w:abstractNum w:abstractNumId="11" w15:restartNumberingAfterBreak="0">
+  <w:abstractNum w:abstractNumId="12" w15:restartNumberingAfterBreak="0">
     <w:nsid w:val="76502E9C"/>
     <w:multiLevelType w:val="multilevel"/>
-    <w:tmpl w:val="091E405C"/>
+    <w:tmpl w:val="2C005786"/>
     <w:lvl w:ilvl="0">
-      <w:start w:val="1"/>
-      <w:numFmt w:val="decimal"/>
-      <w:lvlText w:val="%1."/>
-      <w:lvlJc w:val="left"/>
-      <w:pPr>
-        <w:ind w:left="360" w:hanging="360"/>
-      </w:pPr>
-    </w:lvl>
-    <w:lvl w:ilvl="1">
       <w:start w:val="1"/>
       <w:numFmt w:val="decimal"/>
       <w:pStyle w:val="Heading3"/>
+      <w:lvlText w:val="%1."/>
+      <w:lvlJc w:val="left"/>
+      <w:pPr>
+        <w:ind w:left="360" w:hanging="360"/>
+      </w:pPr>
+    </w:lvl>
+    <w:lvl w:ilvl="1">
+      <w:start w:val="1"/>
+      <w:numFmt w:val="decimal"/>
       <w:lvlText w:val="%1.%2."/>
       <w:lvlJc w:val="left"/>
       <w:pPr>
@@ -6563,16 +6798,16 @@
     <w:abstractNumId w:val="1"/>
   </w:num>
   <w:num w:numId="5" w16cid:durableId="1844320523">
-    <w:abstractNumId w:val="11"/>
+    <w:abstractNumId w:val="12"/>
   </w:num>
   <w:num w:numId="6" w16cid:durableId="2013604388">
-    <w:abstractNumId w:val="10"/>
+    <w:abstractNumId w:val="11"/>
   </w:num>
   <w:num w:numId="7" w16cid:durableId="515778692">
     <w:abstractNumId w:val="0"/>
   </w:num>
   <w:num w:numId="8" w16cid:durableId="1356031321">
-    <w:abstractNumId w:val="9"/>
+    <w:abstractNumId w:val="10"/>
   </w:num>
   <w:num w:numId="9" w16cid:durableId="652683066">
     <w:abstractNumId w:val="6"/>
@@ -6581,7 +6816,7 @@
     <w:abstractNumId w:val="4"/>
   </w:num>
   <w:num w:numId="11" w16cid:durableId="1060249197">
-    <w:abstractNumId w:val="11"/>
+    <w:abstractNumId w:val="12"/>
     <w:lvlOverride w:ilvl="0">
       <w:startOverride w:val="1"/>
     </w:lvlOverride>
@@ -6611,10 +6846,13 @@
     </w:lvlOverride>
   </w:num>
   <w:num w:numId="12" w16cid:durableId="363940914">
-    <w:abstractNumId w:val="8"/>
+    <w:abstractNumId w:val="9"/>
   </w:num>
   <w:num w:numId="13" w16cid:durableId="646935549">
     <w:abstractNumId w:val="2"/>
+  </w:num>
+  <w:num w:numId="14" w16cid:durableId="1984115583">
+    <w:abstractNumId w:val="8"/>
   </w:num>
 </w:numbering>
 </file>
@@ -7074,12 +7312,11 @@
     <w:uiPriority w:val="9"/>
     <w:unhideWhenUsed/>
     <w:qFormat/>
-    <w:rsid w:val="00D77719"/>
+    <w:rsid w:val="00035505"/>
     <w:pPr>
       <w:keepNext/>
       <w:keepLines/>
       <w:numPr>
-        <w:ilvl w:val="1"/>
         <w:numId w:val="5"/>
       </w:numPr>
       <w:spacing w:before="160" w:after="80"/>
@@ -7281,7 +7518,7 @@
     <w:basedOn w:val="DefaultParagraphFont"/>
     <w:link w:val="Heading3"/>
     <w:uiPriority w:val="9"/>
-    <w:rsid w:val="00D77719"/>
+    <w:rsid w:val="00035505"/>
     <w:rPr>
       <w:rFonts w:eastAsiaTheme="majorEastAsia" w:cstheme="majorBidi"/>
       <w:color w:val="0F4761" w:themeColor="accent1" w:themeShade="BF"/>
@@ -7631,6 +7868,36 @@
     <w:rPr>
       <w:color w:val="96607D" w:themeColor="followedHyperlink"/>
       <w:u w:val="single"/>
+    </w:rPr>
+  </w:style>
+  <w:style w:type="paragraph" w:styleId="NormalWeb">
+    <w:name w:val="Normal (Web)"/>
+    <w:basedOn w:val="Normal"/>
+    <w:uiPriority w:val="99"/>
+    <w:semiHidden/>
+    <w:unhideWhenUsed/>
+    <w:rsid w:val="001665B9"/>
+    <w:rPr>
+      <w:rFonts w:ascii="Times New Roman" w:hAnsi="Times New Roman" w:cs="Times New Roman"/>
+    </w:rPr>
+  </w:style>
+  <w:style w:type="paragraph" w:styleId="Caption">
+    <w:name w:val="caption"/>
+    <w:basedOn w:val="Normal"/>
+    <w:next w:val="Normal"/>
+    <w:uiPriority w:val="35"/>
+    <w:unhideWhenUsed/>
+    <w:qFormat/>
+    <w:rsid w:val="00B262CF"/>
+    <w:pPr>
+      <w:spacing w:after="200" w:line="240" w:lineRule="auto"/>
+    </w:pPr>
+    <w:rPr>
+      <w:i/>
+      <w:iCs/>
+      <w:color w:val="0E2841" w:themeColor="text2"/>
+      <w:sz w:val="18"/>
+      <w:szCs w:val="18"/>
     </w:rPr>
   </w:style>
 </w:styles>

</xml_diff>